<commit_message>
full verification of lut and starting loop filter
</commit_message>
<xml_diff>
--- a/FCR.docx
+++ b/FCR.docx
@@ -512,10 +512,10 @@
     <w:p>
       <w:r>
         <w:drawing>
-          <wp:inline distT="0" distB="0" distL="0" distR="0" wp14:anchorId="6782637F" wp14:editId="04FD2E2C">
-            <wp:extent cx="5731510" cy="2122805"/>
+          <wp:inline distT="0" distB="0" distL="0" distR="0" wp14:anchorId="02C09424" wp14:editId="4E7091D6">
+            <wp:extent cx="5731510" cy="3222625"/>
             <wp:effectExtent l="0" t="0" r="2540" b="0"/>
-            <wp:docPr id="2126607192" name="Picture 1" descr="A computer code with text&#10;&#10;AI-generated content may be incorrect."/>
+            <wp:docPr id="1152346436" name="Picture 1" descr="A screenshot of a computer&#10;&#10;AI-generated content may be incorrect."/>
             <wp:cNvGraphicFramePr>
               <a:graphicFrameLocks xmlns:a="http://schemas.openxmlformats.org/drawingml/2006/main" noChangeAspect="1"/>
             </wp:cNvGraphicFramePr>
@@ -523,7 +523,7 @@
               <a:graphicData uri="http://schemas.openxmlformats.org/drawingml/2006/picture">
                 <pic:pic xmlns:pic="http://schemas.openxmlformats.org/drawingml/2006/picture">
                   <pic:nvPicPr>
-                    <pic:cNvPr id="2126607192" name="Picture 1" descr="A computer code with text&#10;&#10;AI-generated content may be incorrect."/>
+                    <pic:cNvPr id="1152346436" name="Picture 1" descr="A screenshot of a computer&#10;&#10;AI-generated content may be incorrect."/>
                     <pic:cNvPicPr/>
                   </pic:nvPicPr>
                   <pic:blipFill>
@@ -535,7 +535,7 @@
                   <pic:spPr>
                     <a:xfrm>
                       <a:off x="0" y="0"/>
-                      <a:ext cx="5731510" cy="2122805"/>
+                      <a:ext cx="5731510" cy="3222625"/>
                     </a:xfrm>
                     <a:prstGeom prst="rect">
                       <a:avLst/>

</xml_diff>

<commit_message>
working with half lut
</commit_message>
<xml_diff>
--- a/FCR.docx
+++ b/FCR.docx
@@ -33,14 +33,8 @@
       <w:pPr>
         <w:pStyle w:val="Title"/>
         <w:jc w:val="center"/>
-        <w:rPr>
-          <w:lang w:val="en-US"/>
-        </w:rPr>
-      </w:pPr>
-      <w:r>
-        <w:rPr>
-          <w:lang w:val="en-US"/>
-        </w:rPr>
+      </w:pPr>
+      <w:r>
         <w:t>PROYECTO FINAL</w:t>
       </w:r>
     </w:p>
@@ -159,8 +153,13 @@
         <w:t>Fine</w:t>
       </w:r>
       <w:r>
-        <w:t xml:space="preserve"> Carrier Recovery</w:t>
-      </w:r>
+        <w:t xml:space="preserve"> Carrier </w:t>
+      </w:r>
+      <w:proofErr w:type="spellStart"/>
+      <w:r>
+        <w:t>Recovery</w:t>
+      </w:r>
+      <w:proofErr w:type="spellEnd"/>
     </w:p>
     <w:p>
       <w:r>
@@ -231,15 +230,44 @@
         </w:r>
       </w:fldSimple>
       <w:r>
-        <w:t xml:space="preserve"> Tx, canal y Rx</w:t>
-      </w:r>
+        <w:t xml:space="preserve"> </w:t>
+      </w:r>
+      <w:proofErr w:type="spellStart"/>
+      <w:r>
+        <w:t>Tx</w:t>
+      </w:r>
+      <w:proofErr w:type="spellEnd"/>
+      <w:r>
+        <w:t xml:space="preserve">, canal y </w:t>
+      </w:r>
+      <w:proofErr w:type="spellStart"/>
+      <w:r>
+        <w:t>Rx</w:t>
+      </w:r>
+      <w:proofErr w:type="spellEnd"/>
     </w:p>
     <w:p>
       <w:r>
         <w:t xml:space="preserve">Donde </w:t>
       </w:r>
       <w:r>
-        <w:t>en el caso ideal, el up converter se “cancela” con el downconverter y tenemos los símbolos transmitidos en el receptor.</w:t>
+        <w:t xml:space="preserve">en el caso ideal, el up </w:t>
+      </w:r>
+      <w:proofErr w:type="spellStart"/>
+      <w:r>
+        <w:t>converter</w:t>
+      </w:r>
+      <w:proofErr w:type="spellEnd"/>
+      <w:r>
+        <w:t xml:space="preserve"> se “cancela” con el </w:t>
+      </w:r>
+      <w:proofErr w:type="spellStart"/>
+      <w:r>
+        <w:t>downconverter</w:t>
+      </w:r>
+      <w:proofErr w:type="spellEnd"/>
+      <w:r>
+        <w:t xml:space="preserve"> y tenemos los símbolos transmitidos en el receptor.</w:t>
       </w:r>
     </w:p>
     <w:p>
@@ -252,8 +280,13 @@
       <w:r>
         <w:t xml:space="preserve">existe un desfasaje entre ambos osciladores, por lo </w:t>
       </w:r>
-      <w:r>
-        <w:t>que en el receptor, en vez de tener los símbolos transmitidos, tenemos lo siguiente.</w:t>
+      <w:proofErr w:type="gramStart"/>
+      <w:r>
+        <w:t>que</w:t>
+      </w:r>
+      <w:proofErr w:type="gramEnd"/>
+      <w:r>
+        <w:t xml:space="preserve"> en el receptor, en vez de tener los símbolos transmitidos, tenemos lo siguiente.</w:t>
       </w:r>
     </w:p>
     <w:p>
@@ -305,12 +338,35 @@
       <w:r>
         <w:t>“</w:t>
       </w:r>
-      <w:r>
-        <w:rPr>
-          <w:lang w:val="en-GB"/>
-        </w:rPr>
-        <w:t>decision directed carrier recovery</w:t>
-      </w:r>
+      <w:proofErr w:type="spellStart"/>
+      <w:r>
+        <w:t>decision</w:t>
+      </w:r>
+      <w:proofErr w:type="spellEnd"/>
+      <w:r>
+        <w:t xml:space="preserve"> </w:t>
+      </w:r>
+      <w:proofErr w:type="spellStart"/>
+      <w:r>
+        <w:t>directed</w:t>
+      </w:r>
+      <w:proofErr w:type="spellEnd"/>
+      <w:r>
+        <w:t xml:space="preserve"> </w:t>
+      </w:r>
+      <w:proofErr w:type="spellStart"/>
+      <w:r>
+        <w:t>carrier</w:t>
+      </w:r>
+      <w:proofErr w:type="spellEnd"/>
+      <w:r>
+        <w:t xml:space="preserve"> </w:t>
+      </w:r>
+      <w:proofErr w:type="spellStart"/>
+      <w:r>
+        <w:t>recovery</w:t>
+      </w:r>
+      <w:proofErr w:type="spellEnd"/>
       <w:r>
         <w:t>”</w:t>
       </w:r>
@@ -378,13 +434,37 @@
     <w:p>
       <w:r>
         <w:lastRenderedPageBreak/>
-        <w:t>Vemos que el sistema usa un pll para calcular la diferencia de fase y corregirla</w:t>
+        <w:t xml:space="preserve">Vemos que el sistema usa un </w:t>
+      </w:r>
+      <w:proofErr w:type="spellStart"/>
+      <w:r>
+        <w:t>pll</w:t>
+      </w:r>
+      <w:proofErr w:type="spellEnd"/>
+      <w:r>
+        <w:t xml:space="preserve"> para calcular la diferencia de fase y corregirla</w:t>
       </w:r>
       <w:r>
         <w:t xml:space="preserve">. Este PLL es de tipo dos debido a que la estimación de fase es una rampa (la fase de entrada es un escalón) por lo que </w:t>
       </w:r>
       <w:r>
-        <w:t>el pll tipo dos es capaz de seguir sin error de estado estacionario.</w:t>
+        <w:t xml:space="preserve">el </w:t>
+      </w:r>
+      <w:proofErr w:type="spellStart"/>
+      <w:r>
+        <w:t>pll</w:t>
+      </w:r>
+      <w:proofErr w:type="spellEnd"/>
+      <w:r>
+        <w:t xml:space="preserve"> tipo dos es </w:t>
+      </w:r>
+      <w:proofErr w:type="gramStart"/>
+      <w:r>
+        <w:t>capaz</w:t>
+      </w:r>
+      <w:proofErr w:type="gramEnd"/>
+      <w:r>
+        <w:t xml:space="preserve"> de seguir sin error de estado estacionario.</w:t>
       </w:r>
       <w:r>
         <w:t xml:space="preserve"> </w:t>
@@ -506,11 +586,19 @@
     </w:p>
     <w:p>
       <w:r>
-        <w:t>Test lut</w:t>
-      </w:r>
-    </w:p>
-    <w:p>
-      <w:r>
+        <w:t xml:space="preserve">Test </w:t>
+      </w:r>
+      <w:proofErr w:type="spellStart"/>
+      <w:r>
+        <w:t>lut</w:t>
+      </w:r>
+      <w:proofErr w:type="spellEnd"/>
+    </w:p>
+    <w:p>
+      <w:r>
+        <w:rPr>
+          <w:noProof/>
+        </w:rPr>
         <w:drawing>
           <wp:inline distT="0" distB="0" distL="0" distR="0" wp14:anchorId="02C09424" wp14:editId="4E7091D6">
             <wp:extent cx="5731510" cy="3222625"/>
@@ -548,6 +636,585 @@
         </w:drawing>
       </w:r>
     </w:p>
+    <w:p>
+      <w:r>
+        <w:br w:type="page"/>
+      </w:r>
+    </w:p>
+    <w:p>
+      <w:pPr>
+        <w:pStyle w:val="Heading1"/>
+      </w:pPr>
+      <w:r>
+        <w:lastRenderedPageBreak/>
+        <w:t>Simulaciones</w:t>
+      </w:r>
+    </w:p>
+    <w:p>
+      <w:proofErr w:type="spellStart"/>
+      <w:r>
+        <w:t>Fcr_high_level_</w:t>
+      </w:r>
+      <w:proofErr w:type="gramStart"/>
+      <w:r>
+        <w:t>fxp.ipynb</w:t>
+      </w:r>
+      <w:proofErr w:type="spellEnd"/>
+      <w:proofErr w:type="gramEnd"/>
+    </w:p>
+    <w:p>
+      <w:proofErr w:type="spellStart"/>
+      <w:r>
+        <w:t>Tx</w:t>
+      </w:r>
+      <w:proofErr w:type="spellEnd"/>
+    </w:p>
+    <w:p>
+      <w:r>
+        <w:drawing>
+          <wp:inline distT="0" distB="0" distL="0" distR="0" wp14:anchorId="59C57993" wp14:editId="68AA7856">
+            <wp:extent cx="2794000" cy="2681238"/>
+            <wp:effectExtent l="0" t="0" r="6350" b="5080"/>
+            <wp:docPr id="1750567578" name="Picture 1" descr="A grid with blue dots&#10;&#10;AI-generated content may be incorrect."/>
+            <wp:cNvGraphicFramePr>
+              <a:graphicFrameLocks xmlns:a="http://schemas.openxmlformats.org/drawingml/2006/main" noChangeAspect="1"/>
+            </wp:cNvGraphicFramePr>
+            <a:graphic xmlns:a="http://schemas.openxmlformats.org/drawingml/2006/main">
+              <a:graphicData uri="http://schemas.openxmlformats.org/drawingml/2006/picture">
+                <pic:pic xmlns:pic="http://schemas.openxmlformats.org/drawingml/2006/picture">
+                  <pic:nvPicPr>
+                    <pic:cNvPr id="1750567578" name="Picture 1" descr="A grid with blue dots&#10;&#10;AI-generated content may be incorrect."/>
+                    <pic:cNvPicPr/>
+                  </pic:nvPicPr>
+                  <pic:blipFill>
+                    <a:blip r:embed="rId10"/>
+                    <a:stretch>
+                      <a:fillRect/>
+                    </a:stretch>
+                  </pic:blipFill>
+                  <pic:spPr>
+                    <a:xfrm>
+                      <a:off x="0" y="0"/>
+                      <a:ext cx="2796562" cy="2683696"/>
+                    </a:xfrm>
+                    <a:prstGeom prst="rect">
+                      <a:avLst/>
+                    </a:prstGeom>
+                  </pic:spPr>
+                </pic:pic>
+              </a:graphicData>
+            </a:graphic>
+          </wp:inline>
+        </w:drawing>
+      </w:r>
+      <w:r>
+        <w:drawing>
+          <wp:inline distT="0" distB="0" distL="0" distR="0" wp14:anchorId="05BB9D6C" wp14:editId="509552C7">
+            <wp:extent cx="2787403" cy="2621998"/>
+            <wp:effectExtent l="0" t="0" r="0" b="6985"/>
+            <wp:docPr id="945099624" name="Picture 1" descr="A graph with a circle in the center&#10;&#10;AI-generated content may be incorrect."/>
+            <wp:cNvGraphicFramePr>
+              <a:graphicFrameLocks xmlns:a="http://schemas.openxmlformats.org/drawingml/2006/main" noChangeAspect="1"/>
+            </wp:cNvGraphicFramePr>
+            <a:graphic xmlns:a="http://schemas.openxmlformats.org/drawingml/2006/main">
+              <a:graphicData uri="http://schemas.openxmlformats.org/drawingml/2006/picture">
+                <pic:pic xmlns:pic="http://schemas.openxmlformats.org/drawingml/2006/picture">
+                  <pic:nvPicPr>
+                    <pic:cNvPr id="945099624" name="Picture 1" descr="A graph with a circle in the center&#10;&#10;AI-generated content may be incorrect."/>
+                    <pic:cNvPicPr/>
+                  </pic:nvPicPr>
+                  <pic:blipFill>
+                    <a:blip r:embed="rId11"/>
+                    <a:stretch>
+                      <a:fillRect/>
+                    </a:stretch>
+                  </pic:blipFill>
+                  <pic:spPr>
+                    <a:xfrm>
+                      <a:off x="0" y="0"/>
+                      <a:ext cx="2808051" cy="2641421"/>
+                    </a:xfrm>
+                    <a:prstGeom prst="rect">
+                      <a:avLst/>
+                    </a:prstGeom>
+                  </pic:spPr>
+                </pic:pic>
+              </a:graphicData>
+            </a:graphic>
+          </wp:inline>
+        </w:drawing>
+      </w:r>
+    </w:p>
+    <w:p>
+      <w:proofErr w:type="spellStart"/>
+      <w:r>
+        <w:t>Rx</w:t>
+      </w:r>
+      <w:proofErr w:type="spellEnd"/>
+    </w:p>
+    <w:p>
+      <w:r>
+        <w:drawing>
+          <wp:inline distT="0" distB="0" distL="0" distR="0" wp14:anchorId="0793335B" wp14:editId="388BE12B">
+            <wp:extent cx="2750512" cy="2625725"/>
+            <wp:effectExtent l="0" t="0" r="0" b="3175"/>
+            <wp:docPr id="348637279" name="Picture 1" descr="A graph with a line&#10;&#10;AI-generated content may be incorrect."/>
+            <wp:cNvGraphicFramePr>
+              <a:graphicFrameLocks xmlns:a="http://schemas.openxmlformats.org/drawingml/2006/main" noChangeAspect="1"/>
+            </wp:cNvGraphicFramePr>
+            <a:graphic xmlns:a="http://schemas.openxmlformats.org/drawingml/2006/main">
+              <a:graphicData uri="http://schemas.openxmlformats.org/drawingml/2006/picture">
+                <pic:pic xmlns:pic="http://schemas.openxmlformats.org/drawingml/2006/picture">
+                  <pic:nvPicPr>
+                    <pic:cNvPr id="348637279" name="Picture 1" descr="A graph with a line&#10;&#10;AI-generated content may be incorrect."/>
+                    <pic:cNvPicPr/>
+                  </pic:nvPicPr>
+                  <pic:blipFill>
+                    <a:blip r:embed="rId12"/>
+                    <a:stretch>
+                      <a:fillRect/>
+                    </a:stretch>
+                  </pic:blipFill>
+                  <pic:spPr>
+                    <a:xfrm>
+                      <a:off x="0" y="0"/>
+                      <a:ext cx="2757760" cy="2632644"/>
+                    </a:xfrm>
+                    <a:prstGeom prst="rect">
+                      <a:avLst/>
+                    </a:prstGeom>
+                  </pic:spPr>
+                </pic:pic>
+              </a:graphicData>
+            </a:graphic>
+          </wp:inline>
+        </w:drawing>
+      </w:r>
+      <w:r>
+        <w:drawing>
+          <wp:inline distT="0" distB="0" distL="0" distR="0" wp14:anchorId="67A46115" wp14:editId="64C5ACBE">
+            <wp:extent cx="2706049" cy="2596838"/>
+            <wp:effectExtent l="0" t="0" r="0" b="0"/>
+            <wp:docPr id="45375033" name="Picture 1" descr="A graph of a number of dots&#10;&#10;AI-generated content may be incorrect."/>
+            <wp:cNvGraphicFramePr>
+              <a:graphicFrameLocks xmlns:a="http://schemas.openxmlformats.org/drawingml/2006/main" noChangeAspect="1"/>
+            </wp:cNvGraphicFramePr>
+            <a:graphic xmlns:a="http://schemas.openxmlformats.org/drawingml/2006/main">
+              <a:graphicData uri="http://schemas.openxmlformats.org/drawingml/2006/picture">
+                <pic:pic xmlns:pic="http://schemas.openxmlformats.org/drawingml/2006/picture">
+                  <pic:nvPicPr>
+                    <pic:cNvPr id="45375033" name="Picture 1" descr="A graph of a number of dots&#10;&#10;AI-generated content may be incorrect."/>
+                    <pic:cNvPicPr/>
+                  </pic:nvPicPr>
+                  <pic:blipFill>
+                    <a:blip r:embed="rId13"/>
+                    <a:stretch>
+                      <a:fillRect/>
+                    </a:stretch>
+                  </pic:blipFill>
+                  <pic:spPr>
+                    <a:xfrm>
+                      <a:off x="0" y="0"/>
+                      <a:ext cx="2717949" cy="2608257"/>
+                    </a:xfrm>
+                    <a:prstGeom prst="rect">
+                      <a:avLst/>
+                    </a:prstGeom>
+                  </pic:spPr>
+                </pic:pic>
+              </a:graphicData>
+            </a:graphic>
+          </wp:inline>
+        </w:drawing>
+      </w:r>
+    </w:p>
+    <w:p/>
+    <w:p>
+      <w:r>
+        <w:br w:type="page"/>
+      </w:r>
+    </w:p>
+    <w:p>
+      <w:pPr>
+        <w:pStyle w:val="Heading1"/>
+      </w:pPr>
+      <w:r>
+        <w:lastRenderedPageBreak/>
+        <w:t>RTL</w:t>
+      </w:r>
+    </w:p>
+    <w:p>
+      <w:proofErr w:type="spellStart"/>
+      <w:r>
+        <w:t>Half</w:t>
+      </w:r>
+      <w:proofErr w:type="spellEnd"/>
+      <w:r>
+        <w:t xml:space="preserve"> LUT and </w:t>
+      </w:r>
+      <w:proofErr w:type="spellStart"/>
+      <w:r>
+        <w:t>rounding</w:t>
+      </w:r>
+      <w:proofErr w:type="spellEnd"/>
+    </w:p>
+    <w:p>
+      <w:r>
+        <w:drawing>
+          <wp:inline distT="0" distB="0" distL="0" distR="0" wp14:anchorId="6DC5E84C" wp14:editId="176895FE">
+            <wp:extent cx="2718037" cy="2540000"/>
+            <wp:effectExtent l="0" t="0" r="6350" b="0"/>
+            <wp:docPr id="1593230754" name="Picture 1" descr="A graph with numbers and dots&#10;&#10;AI-generated content may be incorrect."/>
+            <wp:cNvGraphicFramePr>
+              <a:graphicFrameLocks xmlns:a="http://schemas.openxmlformats.org/drawingml/2006/main" noChangeAspect="1"/>
+            </wp:cNvGraphicFramePr>
+            <a:graphic xmlns:a="http://schemas.openxmlformats.org/drawingml/2006/main">
+              <a:graphicData uri="http://schemas.openxmlformats.org/drawingml/2006/picture">
+                <pic:pic xmlns:pic="http://schemas.openxmlformats.org/drawingml/2006/picture">
+                  <pic:nvPicPr>
+                    <pic:cNvPr id="1593230754" name="Picture 1" descr="A graph with numbers and dots&#10;&#10;AI-generated content may be incorrect."/>
+                    <pic:cNvPicPr/>
+                  </pic:nvPicPr>
+                  <pic:blipFill>
+                    <a:blip r:embed="rId14"/>
+                    <a:stretch>
+                      <a:fillRect/>
+                    </a:stretch>
+                  </pic:blipFill>
+                  <pic:spPr>
+                    <a:xfrm>
+                      <a:off x="0" y="0"/>
+                      <a:ext cx="2720138" cy="2541964"/>
+                    </a:xfrm>
+                    <a:prstGeom prst="rect">
+                      <a:avLst/>
+                    </a:prstGeom>
+                  </pic:spPr>
+                </pic:pic>
+              </a:graphicData>
+            </a:graphic>
+          </wp:inline>
+        </w:drawing>
+      </w:r>
+    </w:p>
+    <w:p>
+      <w:proofErr w:type="spellStart"/>
+      <w:r>
+        <w:t>Phase</w:t>
+      </w:r>
+      <w:proofErr w:type="spellEnd"/>
+      <w:r>
+        <w:t xml:space="preserve"> error</w:t>
+      </w:r>
+    </w:p>
+    <w:p>
+      <w:r>
+        <w:drawing>
+          <wp:inline distT="0" distB="0" distL="0" distR="0" wp14:anchorId="0D6101F3" wp14:editId="1A8E5E76">
+            <wp:extent cx="5731510" cy="878840"/>
+            <wp:effectExtent l="0" t="0" r="2540" b="0"/>
+            <wp:docPr id="1291843716" name="Picture 1" descr="A screen shot of a phone&#10;&#10;AI-generated content may be incorrect."/>
+            <wp:cNvGraphicFramePr>
+              <a:graphicFrameLocks xmlns:a="http://schemas.openxmlformats.org/drawingml/2006/main" noChangeAspect="1"/>
+            </wp:cNvGraphicFramePr>
+            <a:graphic xmlns:a="http://schemas.openxmlformats.org/drawingml/2006/main">
+              <a:graphicData uri="http://schemas.openxmlformats.org/drawingml/2006/picture">
+                <pic:pic xmlns:pic="http://schemas.openxmlformats.org/drawingml/2006/picture">
+                  <pic:nvPicPr>
+                    <pic:cNvPr id="1291843716" name="Picture 1" descr="A screen shot of a phone&#10;&#10;AI-generated content may be incorrect."/>
+                    <pic:cNvPicPr/>
+                  </pic:nvPicPr>
+                  <pic:blipFill>
+                    <a:blip r:embed="rId15"/>
+                    <a:stretch>
+                      <a:fillRect/>
+                    </a:stretch>
+                  </pic:blipFill>
+                  <pic:spPr>
+                    <a:xfrm>
+                      <a:off x="0" y="0"/>
+                      <a:ext cx="5731510" cy="878840"/>
+                    </a:xfrm>
+                    <a:prstGeom prst="rect">
+                      <a:avLst/>
+                    </a:prstGeom>
+                  </pic:spPr>
+                </pic:pic>
+              </a:graphicData>
+            </a:graphic>
+          </wp:inline>
+        </w:drawing>
+      </w:r>
+    </w:p>
+    <w:p>
+      <w:proofErr w:type="spellStart"/>
+      <w:r>
+        <w:t>Integrator</w:t>
+      </w:r>
+      <w:proofErr w:type="spellEnd"/>
+    </w:p>
+    <w:p>
+      <w:r>
+        <w:drawing>
+          <wp:inline distT="0" distB="0" distL="0" distR="0" wp14:anchorId="7BC54D4A" wp14:editId="2406C391">
+            <wp:extent cx="5731510" cy="533400"/>
+            <wp:effectExtent l="0" t="0" r="2540" b="0"/>
+            <wp:docPr id="425716610" name="Picture 1"/>
+            <wp:cNvGraphicFramePr>
+              <a:graphicFrameLocks xmlns:a="http://schemas.openxmlformats.org/drawingml/2006/main" noChangeAspect="1"/>
+            </wp:cNvGraphicFramePr>
+            <a:graphic xmlns:a="http://schemas.openxmlformats.org/drawingml/2006/main">
+              <a:graphicData uri="http://schemas.openxmlformats.org/drawingml/2006/picture">
+                <pic:pic xmlns:pic="http://schemas.openxmlformats.org/drawingml/2006/picture">
+                  <pic:nvPicPr>
+                    <pic:cNvPr id="425716610" name=""/>
+                    <pic:cNvPicPr/>
+                  </pic:nvPicPr>
+                  <pic:blipFill>
+                    <a:blip r:embed="rId16"/>
+                    <a:stretch>
+                      <a:fillRect/>
+                    </a:stretch>
+                  </pic:blipFill>
+                  <pic:spPr>
+                    <a:xfrm>
+                      <a:off x="0" y="0"/>
+                      <a:ext cx="5731510" cy="533400"/>
+                    </a:xfrm>
+                    <a:prstGeom prst="rect">
+                      <a:avLst/>
+                    </a:prstGeom>
+                  </pic:spPr>
+                </pic:pic>
+              </a:graphicData>
+            </a:graphic>
+          </wp:inline>
+        </w:drawing>
+      </w:r>
+    </w:p>
+    <w:p>
+      <w:r>
+        <w:t>VCO</w:t>
+      </w:r>
+    </w:p>
+    <w:p>
+      <w:r>
+        <w:drawing>
+          <wp:inline distT="0" distB="0" distL="0" distR="0" wp14:anchorId="08EDCC82" wp14:editId="0B33A612">
+            <wp:extent cx="5731510" cy="770890"/>
+            <wp:effectExtent l="0" t="0" r="2540" b="0"/>
+            <wp:docPr id="1100606408" name="Picture 1" descr="A graph on a screen&#10;&#10;AI-generated content may be incorrect."/>
+            <wp:cNvGraphicFramePr>
+              <a:graphicFrameLocks xmlns:a="http://schemas.openxmlformats.org/drawingml/2006/main" noChangeAspect="1"/>
+            </wp:cNvGraphicFramePr>
+            <a:graphic xmlns:a="http://schemas.openxmlformats.org/drawingml/2006/main">
+              <a:graphicData uri="http://schemas.openxmlformats.org/drawingml/2006/picture">
+                <pic:pic xmlns:pic="http://schemas.openxmlformats.org/drawingml/2006/picture">
+                  <pic:nvPicPr>
+                    <pic:cNvPr id="1100606408" name="Picture 1" descr="A graph on a screen&#10;&#10;AI-generated content may be incorrect."/>
+                    <pic:cNvPicPr/>
+                  </pic:nvPicPr>
+                  <pic:blipFill>
+                    <a:blip r:embed="rId17"/>
+                    <a:stretch>
+                      <a:fillRect/>
+                    </a:stretch>
+                  </pic:blipFill>
+                  <pic:spPr>
+                    <a:xfrm>
+                      <a:off x="0" y="0"/>
+                      <a:ext cx="5731510" cy="770890"/>
+                    </a:xfrm>
+                    <a:prstGeom prst="rect">
+                      <a:avLst/>
+                    </a:prstGeom>
+                  </pic:spPr>
+                </pic:pic>
+              </a:graphicData>
+            </a:graphic>
+          </wp:inline>
+        </w:drawing>
+      </w:r>
+    </w:p>
+    <w:p>
+      <w:r>
+        <w:br w:type="page"/>
+      </w:r>
+    </w:p>
+    <w:p>
+      <w:proofErr w:type="spellStart"/>
+      <w:r>
+        <w:lastRenderedPageBreak/>
+        <w:t>Half</w:t>
+      </w:r>
+      <w:proofErr w:type="spellEnd"/>
+      <w:r>
+        <w:t xml:space="preserve"> LUT </w:t>
+      </w:r>
+      <w:proofErr w:type="spellStart"/>
+      <w:r>
+        <w:t>truncating</w:t>
+      </w:r>
+      <w:proofErr w:type="spellEnd"/>
+    </w:p>
+    <w:p>
+      <w:r>
+        <w:drawing>
+          <wp:inline distT="0" distB="0" distL="0" distR="0" wp14:anchorId="62E7D9FC" wp14:editId="50951722">
+            <wp:extent cx="3155950" cy="2917893"/>
+            <wp:effectExtent l="0" t="0" r="6350" b="0"/>
+            <wp:docPr id="608593497" name="Picture 1" descr="A graph of a number of dots&#10;&#10;AI-generated content may be incorrect."/>
+            <wp:cNvGraphicFramePr>
+              <a:graphicFrameLocks xmlns:a="http://schemas.openxmlformats.org/drawingml/2006/main" noChangeAspect="1"/>
+            </wp:cNvGraphicFramePr>
+            <a:graphic xmlns:a="http://schemas.openxmlformats.org/drawingml/2006/main">
+              <a:graphicData uri="http://schemas.openxmlformats.org/drawingml/2006/picture">
+                <pic:pic xmlns:pic="http://schemas.openxmlformats.org/drawingml/2006/picture">
+                  <pic:nvPicPr>
+                    <pic:cNvPr id="608593497" name="Picture 1" descr="A graph of a number of dots&#10;&#10;AI-generated content may be incorrect."/>
+                    <pic:cNvPicPr/>
+                  </pic:nvPicPr>
+                  <pic:blipFill>
+                    <a:blip r:embed="rId18"/>
+                    <a:stretch>
+                      <a:fillRect/>
+                    </a:stretch>
+                  </pic:blipFill>
+                  <pic:spPr>
+                    <a:xfrm>
+                      <a:off x="0" y="0"/>
+                      <a:ext cx="3156815" cy="2918693"/>
+                    </a:xfrm>
+                    <a:prstGeom prst="rect">
+                      <a:avLst/>
+                    </a:prstGeom>
+                  </pic:spPr>
+                </pic:pic>
+              </a:graphicData>
+            </a:graphic>
+          </wp:inline>
+        </w:drawing>
+      </w:r>
+    </w:p>
+    <w:p>
+      <w:r>
+        <w:drawing>
+          <wp:inline distT="0" distB="0" distL="0" distR="0" wp14:anchorId="6B35EFA7" wp14:editId="069A5D67">
+            <wp:extent cx="5731510" cy="782955"/>
+            <wp:effectExtent l="0" t="0" r="2540" b="0"/>
+            <wp:docPr id="39169278" name="Picture 1" descr="A green sound wave on a black background&#10;&#10;AI-generated content may be incorrect."/>
+            <wp:cNvGraphicFramePr>
+              <a:graphicFrameLocks xmlns:a="http://schemas.openxmlformats.org/drawingml/2006/main" noChangeAspect="1"/>
+            </wp:cNvGraphicFramePr>
+            <a:graphic xmlns:a="http://schemas.openxmlformats.org/drawingml/2006/main">
+              <a:graphicData uri="http://schemas.openxmlformats.org/drawingml/2006/picture">
+                <pic:pic xmlns:pic="http://schemas.openxmlformats.org/drawingml/2006/picture">
+                  <pic:nvPicPr>
+                    <pic:cNvPr id="39169278" name="Picture 1" descr="A green sound wave on a black background&#10;&#10;AI-generated content may be incorrect."/>
+                    <pic:cNvPicPr/>
+                  </pic:nvPicPr>
+                  <pic:blipFill>
+                    <a:blip r:embed="rId19"/>
+                    <a:stretch>
+                      <a:fillRect/>
+                    </a:stretch>
+                  </pic:blipFill>
+                  <pic:spPr>
+                    <a:xfrm>
+                      <a:off x="0" y="0"/>
+                      <a:ext cx="5731510" cy="782955"/>
+                    </a:xfrm>
+                    <a:prstGeom prst="rect">
+                      <a:avLst/>
+                    </a:prstGeom>
+                  </pic:spPr>
+                </pic:pic>
+              </a:graphicData>
+            </a:graphic>
+          </wp:inline>
+        </w:drawing>
+      </w:r>
+    </w:p>
+    <w:p>
+      <w:r>
+        <w:drawing>
+          <wp:inline distT="0" distB="0" distL="0" distR="0" wp14:anchorId="341AC4A4" wp14:editId="2D997F32">
+            <wp:extent cx="5731510" cy="267970"/>
+            <wp:effectExtent l="0" t="0" r="2540" b="0"/>
+            <wp:docPr id="995768977" name="Picture 1"/>
+            <wp:cNvGraphicFramePr>
+              <a:graphicFrameLocks xmlns:a="http://schemas.openxmlformats.org/drawingml/2006/main" noChangeAspect="1"/>
+            </wp:cNvGraphicFramePr>
+            <a:graphic xmlns:a="http://schemas.openxmlformats.org/drawingml/2006/main">
+              <a:graphicData uri="http://schemas.openxmlformats.org/drawingml/2006/picture">
+                <pic:pic xmlns:pic="http://schemas.openxmlformats.org/drawingml/2006/picture">
+                  <pic:nvPicPr>
+                    <pic:cNvPr id="995768977" name=""/>
+                    <pic:cNvPicPr/>
+                  </pic:nvPicPr>
+                  <pic:blipFill>
+                    <a:blip r:embed="rId20"/>
+                    <a:stretch>
+                      <a:fillRect/>
+                    </a:stretch>
+                  </pic:blipFill>
+                  <pic:spPr>
+                    <a:xfrm>
+                      <a:off x="0" y="0"/>
+                      <a:ext cx="5731510" cy="267970"/>
+                    </a:xfrm>
+                    <a:prstGeom prst="rect">
+                      <a:avLst/>
+                    </a:prstGeom>
+                  </pic:spPr>
+                </pic:pic>
+              </a:graphicData>
+            </a:graphic>
+          </wp:inline>
+        </w:drawing>
+      </w:r>
+    </w:p>
+    <w:p/>
+    <w:p>
+      <w:r>
+        <w:drawing>
+          <wp:inline distT="0" distB="0" distL="0" distR="0" wp14:anchorId="7B6BB066" wp14:editId="385C8976">
+            <wp:extent cx="5731510" cy="467995"/>
+            <wp:effectExtent l="0" t="0" r="2540" b="8255"/>
+            <wp:docPr id="1395577700" name="Picture 1"/>
+            <wp:cNvGraphicFramePr>
+              <a:graphicFrameLocks xmlns:a="http://schemas.openxmlformats.org/drawingml/2006/main" noChangeAspect="1"/>
+            </wp:cNvGraphicFramePr>
+            <a:graphic xmlns:a="http://schemas.openxmlformats.org/drawingml/2006/main">
+              <a:graphicData uri="http://schemas.openxmlformats.org/drawingml/2006/picture">
+                <pic:pic xmlns:pic="http://schemas.openxmlformats.org/drawingml/2006/picture">
+                  <pic:nvPicPr>
+                    <pic:cNvPr id="1395577700" name=""/>
+                    <pic:cNvPicPr/>
+                  </pic:nvPicPr>
+                  <pic:blipFill>
+                    <a:blip r:embed="rId21"/>
+                    <a:stretch>
+                      <a:fillRect/>
+                    </a:stretch>
+                  </pic:blipFill>
+                  <pic:spPr>
+                    <a:xfrm>
+                      <a:off x="0" y="0"/>
+                      <a:ext cx="5731510" cy="467995"/>
+                    </a:xfrm>
+                    <a:prstGeom prst="rect">
+                      <a:avLst/>
+                    </a:prstGeom>
+                  </pic:spPr>
+                </pic:pic>
+              </a:graphicData>
+            </a:graphic>
+          </wp:inline>
+        </w:drawing>
+      </w:r>
+    </w:p>
+    <w:p/>
     <w:sectPr>
       <w:pgSz w:w="11906" w:h="16838"/>
       <w:pgMar w:top="1440" w:right="1440" w:bottom="1440" w:left="1440" w:header="708" w:footer="708" w:gutter="0"/>
@@ -1160,6 +1827,7 @@
   <w:style w:type="character" w:default="1" w:styleId="DefaultParagraphFont">
     <w:name w:val="Default Paragraph Font"/>
     <w:uiPriority w:val="1"/>
+    <w:semiHidden/>
     <w:unhideWhenUsed/>
   </w:style>
   <w:style w:type="table" w:default="1" w:styleId="TableNormal">

</xml_diff>

<commit_message>
working in new branch
</commit_message>
<xml_diff>
--- a/FCR.docx
+++ b/FCR.docx
@@ -153,13 +153,8 @@
         <w:t>Fine</w:t>
       </w:r>
       <w:r>
-        <w:t xml:space="preserve"> Carrier </w:t>
-      </w:r>
-      <w:proofErr w:type="spellStart"/>
-      <w:r>
-        <w:t>Recovery</w:t>
-      </w:r>
-      <w:proofErr w:type="spellEnd"/>
+        <w:t xml:space="preserve"> Carrier Recovery</w:t>
+      </w:r>
     </w:p>
     <w:p>
       <w:r>
@@ -193,7 +188,7 @@
                     <pic:cNvPicPr/>
                   </pic:nvPicPr>
                   <pic:blipFill>
-                    <a:blip r:embed="rId4"/>
+                    <a:blip r:embed="rId5"/>
                     <a:stretch>
                       <a:fillRect/>
                     </a:stretch>
@@ -230,44 +225,15 @@
         </w:r>
       </w:fldSimple>
       <w:r>
-        <w:t xml:space="preserve"> </w:t>
-      </w:r>
-      <w:proofErr w:type="spellStart"/>
-      <w:r>
-        <w:t>Tx</w:t>
-      </w:r>
-      <w:proofErr w:type="spellEnd"/>
-      <w:r>
-        <w:t xml:space="preserve">, canal y </w:t>
-      </w:r>
-      <w:proofErr w:type="spellStart"/>
-      <w:r>
-        <w:t>Rx</w:t>
-      </w:r>
-      <w:proofErr w:type="spellEnd"/>
+        <w:t xml:space="preserve"> Tx, canal y Rx</w:t>
+      </w:r>
     </w:p>
     <w:p>
       <w:r>
         <w:t xml:space="preserve">Donde </w:t>
       </w:r>
       <w:r>
-        <w:t xml:space="preserve">en el caso ideal, el up </w:t>
-      </w:r>
-      <w:proofErr w:type="spellStart"/>
-      <w:r>
-        <w:t>converter</w:t>
-      </w:r>
-      <w:proofErr w:type="spellEnd"/>
-      <w:r>
-        <w:t xml:space="preserve"> se “cancela” con el </w:t>
-      </w:r>
-      <w:proofErr w:type="spellStart"/>
-      <w:r>
-        <w:t>downconverter</w:t>
-      </w:r>
-      <w:proofErr w:type="spellEnd"/>
-      <w:r>
-        <w:t xml:space="preserve"> y tenemos los símbolos transmitidos en el receptor.</w:t>
+        <w:t>en el caso ideal, el up converter se “cancela” con el downconverter y tenemos los símbolos transmitidos en el receptor.</w:t>
       </w:r>
     </w:p>
     <w:p>
@@ -280,13 +246,8 @@
       <w:r>
         <w:t xml:space="preserve">existe un desfasaje entre ambos osciladores, por lo </w:t>
       </w:r>
-      <w:proofErr w:type="gramStart"/>
-      <w:r>
-        <w:t>que</w:t>
-      </w:r>
-      <w:proofErr w:type="gramEnd"/>
-      <w:r>
-        <w:t xml:space="preserve"> en el receptor, en vez de tener los símbolos transmitidos, tenemos lo siguiente.</w:t>
+      <w:r>
+        <w:t>que en el receptor, en vez de tener los símbolos transmitidos, tenemos lo siguiente.</w:t>
       </w:r>
     </w:p>
     <w:p>
@@ -310,7 +271,7 @@
                     <pic:cNvPicPr/>
                   </pic:nvPicPr>
                   <pic:blipFill>
-                    <a:blip r:embed="rId5"/>
+                    <a:blip r:embed="rId6"/>
                     <a:stretch>
                       <a:fillRect/>
                     </a:stretch>
@@ -338,35 +299,9 @@
       <w:r>
         <w:t>“</w:t>
       </w:r>
-      <w:proofErr w:type="spellStart"/>
-      <w:r>
-        <w:t>decision</w:t>
-      </w:r>
-      <w:proofErr w:type="spellEnd"/>
-      <w:r>
-        <w:t xml:space="preserve"> </w:t>
-      </w:r>
-      <w:proofErr w:type="spellStart"/>
-      <w:r>
-        <w:t>directed</w:t>
-      </w:r>
-      <w:proofErr w:type="spellEnd"/>
-      <w:r>
-        <w:t xml:space="preserve"> </w:t>
-      </w:r>
-      <w:proofErr w:type="spellStart"/>
-      <w:r>
-        <w:t>carrier</w:t>
-      </w:r>
-      <w:proofErr w:type="spellEnd"/>
-      <w:r>
-        <w:t xml:space="preserve"> </w:t>
-      </w:r>
-      <w:proofErr w:type="spellStart"/>
-      <w:r>
-        <w:t>recovery</w:t>
-      </w:r>
-      <w:proofErr w:type="spellEnd"/>
+      <w:r>
+        <w:t>decision directed carrier recovery</w:t>
+      </w:r>
       <w:r>
         <w:t>”</w:t>
       </w:r>
@@ -410,7 +345,7 @@
                     <pic:cNvPicPr/>
                   </pic:nvPicPr>
                   <pic:blipFill>
-                    <a:blip r:embed="rId6"/>
+                    <a:blip r:embed="rId7"/>
                     <a:stretch>
                       <a:fillRect/>
                     </a:stretch>
@@ -434,37 +369,13 @@
     <w:p>
       <w:r>
         <w:lastRenderedPageBreak/>
-        <w:t xml:space="preserve">Vemos que el sistema usa un </w:t>
-      </w:r>
-      <w:proofErr w:type="spellStart"/>
-      <w:r>
-        <w:t>pll</w:t>
-      </w:r>
-      <w:proofErr w:type="spellEnd"/>
-      <w:r>
-        <w:t xml:space="preserve"> para calcular la diferencia de fase y corregirla</w:t>
+        <w:t>Vemos que el sistema usa un pll para calcular la diferencia de fase y corregirla</w:t>
       </w:r>
       <w:r>
         <w:t xml:space="preserve">. Este PLL es de tipo dos debido a que la estimación de fase es una rampa (la fase de entrada es un escalón) por lo que </w:t>
       </w:r>
       <w:r>
-        <w:t xml:space="preserve">el </w:t>
-      </w:r>
-      <w:proofErr w:type="spellStart"/>
-      <w:r>
-        <w:t>pll</w:t>
-      </w:r>
-      <w:proofErr w:type="spellEnd"/>
-      <w:r>
-        <w:t xml:space="preserve"> tipo dos es </w:t>
-      </w:r>
-      <w:proofErr w:type="gramStart"/>
-      <w:r>
-        <w:t>capaz</w:t>
-      </w:r>
-      <w:proofErr w:type="gramEnd"/>
-      <w:r>
-        <w:t xml:space="preserve"> de seguir sin error de estado estacionario.</w:t>
+        <w:t>el pll tipo dos es capaz de seguir sin error de estado estacionario.</w:t>
       </w:r>
       <w:r>
         <w:t xml:space="preserve"> </w:t>
@@ -502,7 +413,7 @@
                     <pic:cNvPicPr/>
                   </pic:nvPicPr>
                   <pic:blipFill>
-                    <a:blip r:embed="rId7"/>
+                    <a:blip r:embed="rId8"/>
                     <a:stretch>
                       <a:fillRect/>
                     </a:stretch>
@@ -549,7 +460,7 @@
                     <pic:cNvPicPr/>
                   </pic:nvPicPr>
                   <pic:blipFill>
-                    <a:blip r:embed="rId8"/>
+                    <a:blip r:embed="rId9"/>
                     <a:stretch>
                       <a:fillRect/>
                     </a:stretch>
@@ -586,13 +497,8 @@
     </w:p>
     <w:p>
       <w:r>
-        <w:t xml:space="preserve">Test </w:t>
-      </w:r>
-      <w:proofErr w:type="spellStart"/>
-      <w:r>
-        <w:t>lut</w:t>
-      </w:r>
-      <w:proofErr w:type="spellEnd"/>
+        <w:t>Test lut</w:t>
+      </w:r>
     </w:p>
     <w:p>
       <w:r>
@@ -615,7 +521,7 @@
                     <pic:cNvPicPr/>
                   </pic:nvPicPr>
                   <pic:blipFill>
-                    <a:blip r:embed="rId9"/>
+                    <a:blip r:embed="rId10"/>
                     <a:stretch>
                       <a:fillRect/>
                     </a:stretch>
@@ -651,23 +557,14 @@
       </w:r>
     </w:p>
     <w:p>
-      <w:proofErr w:type="spellStart"/>
-      <w:r>
-        <w:t>Fcr_high_level_</w:t>
-      </w:r>
-      <w:proofErr w:type="gramStart"/>
-      <w:r>
-        <w:t>fxp.ipynb</w:t>
-      </w:r>
-      <w:proofErr w:type="spellEnd"/>
-      <w:proofErr w:type="gramEnd"/>
-    </w:p>
-    <w:p>
-      <w:proofErr w:type="spellStart"/>
+      <w:r>
+        <w:t>Fcr_high_level_fxp.ipynb</w:t>
+      </w:r>
+    </w:p>
+    <w:p>
       <w:r>
         <w:t>Tx</w:t>
       </w:r>
-      <w:proofErr w:type="spellEnd"/>
     </w:p>
     <w:p>
       <w:r>
@@ -690,7 +587,7 @@
                     <pic:cNvPicPr/>
                   </pic:nvPicPr>
                   <pic:blipFill>
-                    <a:blip r:embed="rId10"/>
+                    <a:blip r:embed="rId11"/>
                     <a:stretch>
                       <a:fillRect/>
                     </a:stretch>
@@ -730,7 +627,7 @@
                     <pic:cNvPicPr/>
                   </pic:nvPicPr>
                   <pic:blipFill>
-                    <a:blip r:embed="rId11"/>
+                    <a:blip r:embed="rId12"/>
                     <a:stretch>
                       <a:fillRect/>
                     </a:stretch>
@@ -752,11 +649,9 @@
       </w:r>
     </w:p>
     <w:p>
-      <w:proofErr w:type="spellStart"/>
       <w:r>
         <w:t>Rx</w:t>
       </w:r>
-      <w:proofErr w:type="spellEnd"/>
     </w:p>
     <w:p>
       <w:r>
@@ -779,7 +674,7 @@
                     <pic:cNvPicPr/>
                   </pic:nvPicPr>
                   <pic:blipFill>
-                    <a:blip r:embed="rId12"/>
+                    <a:blip r:embed="rId13"/>
                     <a:stretch>
                       <a:fillRect/>
                     </a:stretch>
@@ -819,7 +714,7 @@
                     <pic:cNvPicPr/>
                   </pic:nvPicPr>
                   <pic:blipFill>
-                    <a:blip r:embed="rId13"/>
+                    <a:blip r:embed="rId14"/>
                     <a:stretch>
                       <a:fillRect/>
                     </a:stretch>
@@ -856,19 +751,9 @@
       </w:r>
     </w:p>
     <w:p>
-      <w:proofErr w:type="spellStart"/>
-      <w:r>
-        <w:t>Half</w:t>
-      </w:r>
-      <w:proofErr w:type="spellEnd"/>
-      <w:r>
-        <w:t xml:space="preserve"> LUT and </w:t>
-      </w:r>
-      <w:proofErr w:type="spellStart"/>
-      <w:r>
-        <w:t>rounding</w:t>
-      </w:r>
-      <w:proofErr w:type="spellEnd"/>
+      <w:r>
+        <w:t>Half LUT and rounding</w:t>
+      </w:r>
     </w:p>
     <w:p>
       <w:r>
@@ -891,7 +776,7 @@
                     <pic:cNvPicPr/>
                   </pic:nvPicPr>
                   <pic:blipFill>
-                    <a:blip r:embed="rId14"/>
+                    <a:blip r:embed="rId15"/>
                     <a:stretch>
                       <a:fillRect/>
                     </a:stretch>
@@ -913,13 +798,8 @@
       </w:r>
     </w:p>
     <w:p>
-      <w:proofErr w:type="spellStart"/>
-      <w:r>
-        <w:t>Phase</w:t>
-      </w:r>
-      <w:proofErr w:type="spellEnd"/>
-      <w:r>
-        <w:t xml:space="preserve"> error</w:t>
+      <w:r>
+        <w:t>Phase error</w:t>
       </w:r>
     </w:p>
     <w:p>
@@ -943,7 +823,7 @@
                     <pic:cNvPicPr/>
                   </pic:nvPicPr>
                   <pic:blipFill>
-                    <a:blip r:embed="rId15"/>
+                    <a:blip r:embed="rId16"/>
                     <a:stretch>
                       <a:fillRect/>
                     </a:stretch>
@@ -965,11 +845,9 @@
       </w:r>
     </w:p>
     <w:p>
-      <w:proofErr w:type="spellStart"/>
       <w:r>
         <w:t>Integrator</w:t>
       </w:r>
-      <w:proofErr w:type="spellEnd"/>
     </w:p>
     <w:p>
       <w:r>
@@ -992,7 +870,7 @@
                     <pic:cNvPicPr/>
                   </pic:nvPicPr>
                   <pic:blipFill>
-                    <a:blip r:embed="rId16"/>
+                    <a:blip r:embed="rId17"/>
                     <a:stretch>
                       <a:fillRect/>
                     </a:stretch>
@@ -1039,7 +917,7 @@
                     <pic:cNvPicPr/>
                   </pic:nvPicPr>
                   <pic:blipFill>
-                    <a:blip r:embed="rId17"/>
+                    <a:blip r:embed="rId18"/>
                     <a:stretch>
                       <a:fillRect/>
                     </a:stretch>
@@ -1066,20 +944,10 @@
       </w:r>
     </w:p>
     <w:p>
-      <w:proofErr w:type="spellStart"/>
       <w:r>
         <w:lastRenderedPageBreak/>
-        <w:t>Half</w:t>
-      </w:r>
-      <w:proofErr w:type="spellEnd"/>
-      <w:r>
-        <w:t xml:space="preserve"> LUT </w:t>
-      </w:r>
-      <w:proofErr w:type="spellStart"/>
-      <w:r>
-        <w:t>truncating</w:t>
-      </w:r>
-      <w:proofErr w:type="spellEnd"/>
+        <w:t>Half LUT truncating</w:t>
+      </w:r>
     </w:p>
     <w:p>
       <w:r>
@@ -1102,7 +970,7 @@
                     <pic:cNvPicPr/>
                   </pic:nvPicPr>
                   <pic:blipFill>
-                    <a:blip r:embed="rId18"/>
+                    <a:blip r:embed="rId19"/>
                     <a:stretch>
                       <a:fillRect/>
                     </a:stretch>
@@ -1144,7 +1012,7 @@
                     <pic:cNvPicPr/>
                   </pic:nvPicPr>
                   <pic:blipFill>
-                    <a:blip r:embed="rId19"/>
+                    <a:blip r:embed="rId20"/>
                     <a:stretch>
                       <a:fillRect/>
                     </a:stretch>
@@ -1186,7 +1054,7 @@
                     <pic:cNvPicPr/>
                   </pic:nvPicPr>
                   <pic:blipFill>
-                    <a:blip r:embed="rId20"/>
+                    <a:blip r:embed="rId21"/>
                     <a:stretch>
                       <a:fillRect/>
                     </a:stretch>
@@ -1229,7 +1097,7 @@
                     <pic:cNvPicPr/>
                   </pic:nvPicPr>
                   <pic:blipFill>
-                    <a:blip r:embed="rId21"/>
+                    <a:blip r:embed="rId22"/>
                     <a:stretch>
                       <a:fillRect/>
                     </a:stretch>
@@ -1250,6 +1118,218 @@
         </w:drawing>
       </w:r>
     </w:p>
+    <w:p>
+      <w:r>
+        <w:br w:type="page"/>
+      </w:r>
+    </w:p>
+    <w:p>
+      <w:pPr>
+        <w:pStyle w:val="Heading3"/>
+      </w:pPr>
+      <w:r>
+        <w:lastRenderedPageBreak/>
+        <w:t>Cambio de resolucion</w:t>
+      </w:r>
+    </w:p>
+    <w:p>
+      <w:r>
+        <w:t>Todo 8.7</w:t>
+      </w:r>
+    </w:p>
+    <w:p>
+      <w:r>
+        <w:drawing>
+          <wp:inline distT="0" distB="0" distL="0" distR="0" wp14:anchorId="0CCA0953" wp14:editId="78658DD8">
+            <wp:extent cx="5731510" cy="3599180"/>
+            <wp:effectExtent l="0" t="0" r="2540" b="1270"/>
+            <wp:docPr id="2011059648" name="Picture 1"/>
+            <wp:cNvGraphicFramePr>
+              <a:graphicFrameLocks xmlns:a="http://schemas.openxmlformats.org/drawingml/2006/main" noChangeAspect="1"/>
+            </wp:cNvGraphicFramePr>
+            <a:graphic xmlns:a="http://schemas.openxmlformats.org/drawingml/2006/main">
+              <a:graphicData uri="http://schemas.openxmlformats.org/drawingml/2006/picture">
+                <pic:pic xmlns:pic="http://schemas.openxmlformats.org/drawingml/2006/picture">
+                  <pic:nvPicPr>
+                    <pic:cNvPr id="2011059648" name=""/>
+                    <pic:cNvPicPr/>
+                  </pic:nvPicPr>
+                  <pic:blipFill>
+                    <a:blip r:embed="rId23"/>
+                    <a:stretch>
+                      <a:fillRect/>
+                    </a:stretch>
+                  </pic:blipFill>
+                  <pic:spPr>
+                    <a:xfrm>
+                      <a:off x="0" y="0"/>
+                      <a:ext cx="5731510" cy="3599180"/>
+                    </a:xfrm>
+                    <a:prstGeom prst="rect">
+                      <a:avLst/>
+                    </a:prstGeom>
+                  </pic:spPr>
+                </pic:pic>
+              </a:graphicData>
+            </a:graphic>
+          </wp:inline>
+        </w:drawing>
+      </w:r>
+    </w:p>
+    <w:p>
+      <w:r>
+        <w:t>Pero si agrego un registro mas de latencia se rompe</w:t>
+      </w:r>
+    </w:p>
+    <w:p>
+      <w:r>
+        <w:t>Pasos para cambiar resolución:</w:t>
+      </w:r>
+    </w:p>
+    <w:p>
+      <w:pPr>
+        <w:pStyle w:val="ListParagraph"/>
+        <w:numPr>
+          <w:ilvl w:val="0"/>
+          <w:numId w:val="1"/>
+        </w:numPr>
+      </w:pPr>
+      <w:r>
+        <w:t>Cambiar en TB</w:t>
+      </w:r>
+    </w:p>
+    <w:p>
+      <w:pPr>
+        <w:pStyle w:val="ListParagraph"/>
+        <w:numPr>
+          <w:ilvl w:val="0"/>
+          <w:numId w:val="1"/>
+        </w:numPr>
+      </w:pPr>
+      <w:r>
+        <w:t>Cambiar en Carrier recovery top</w:t>
+      </w:r>
+    </w:p>
+    <w:p>
+      <w:pPr>
+        <w:pStyle w:val="ListParagraph"/>
+        <w:numPr>
+          <w:ilvl w:val="0"/>
+          <w:numId w:val="1"/>
+        </w:numPr>
+      </w:pPr>
+      <w:r>
+        <w:t>Cambiar en pase detector</w:t>
+      </w:r>
+    </w:p>
+    <w:p>
+      <w:pPr>
+        <w:pStyle w:val="ListParagraph"/>
+        <w:numPr>
+          <w:ilvl w:val="1"/>
+          <w:numId w:val="1"/>
+        </w:numPr>
+      </w:pPr>
+      <w:r>
+        <w:t>Resoluciones y PI</w:t>
+      </w:r>
+    </w:p>
+    <w:p>
+      <w:pPr>
+        <w:pStyle w:val="ListParagraph"/>
+        <w:numPr>
+          <w:ilvl w:val="1"/>
+          <w:numId w:val="1"/>
+        </w:numPr>
+      </w:pPr>
+      <w:r>
+        <w:t>Cambiar ram</w:t>
+      </w:r>
+    </w:p>
+    <w:p>
+      <w:pPr>
+        <w:pStyle w:val="ListParagraph"/>
+        <w:numPr>
+          <w:ilvl w:val="0"/>
+          <w:numId w:val="1"/>
+        </w:numPr>
+      </w:pPr>
+      <w:r>
+        <w:t>Cambiar la lut</w:t>
+      </w:r>
+    </w:p>
+    <w:p>
+      <w:pPr>
+        <w:pStyle w:val="ListParagraph"/>
+        <w:numPr>
+          <w:ilvl w:val="1"/>
+          <w:numId w:val="1"/>
+        </w:numPr>
+      </w:pPr>
+      <w:r>
+        <w:t>Correr mem to coe</w:t>
+      </w:r>
+    </w:p>
+    <w:p>
+      <w:pPr>
+        <w:pStyle w:val="ListParagraph"/>
+        <w:numPr>
+          <w:ilvl w:val="0"/>
+          <w:numId w:val="1"/>
+        </w:numPr>
+      </w:pPr>
+      <w:r>
+        <w:t>Cambiar loop filter</w:t>
+      </w:r>
+    </w:p>
+    <w:p>
+      <w:pPr>
+        <w:pStyle w:val="ListParagraph"/>
+        <w:numPr>
+          <w:ilvl w:val="1"/>
+          <w:numId w:val="1"/>
+        </w:numPr>
+      </w:pPr>
+      <w:r>
+        <w:t>Cambiar constantes</w:t>
+      </w:r>
+    </w:p>
+    <w:p>
+      <w:pPr>
+        <w:pStyle w:val="ListParagraph"/>
+        <w:numPr>
+          <w:ilvl w:val="0"/>
+          <w:numId w:val="1"/>
+        </w:numPr>
+      </w:pPr>
+      <w:r>
+        <w:t>Cambiar vco</w:t>
+      </w:r>
+    </w:p>
+    <w:p>
+      <w:pPr>
+        <w:pStyle w:val="ListParagraph"/>
+        <w:numPr>
+          <w:ilvl w:val="0"/>
+          <w:numId w:val="1"/>
+        </w:numPr>
+      </w:pPr>
+      <w:r>
+        <w:t>Cambiar sin and cos</w:t>
+      </w:r>
+    </w:p>
+    <w:p>
+      <w:pPr>
+        <w:pStyle w:val="ListParagraph"/>
+        <w:numPr>
+          <w:ilvl w:val="1"/>
+          <w:numId w:val="1"/>
+        </w:numPr>
+      </w:pPr>
+      <w:r>
+        <w:t>Cambiar ram</w:t>
+      </w:r>
+    </w:p>
     <w:p/>
     <w:sectPr>
       <w:pgSz w:w="11906" w:h="16838"/>
@@ -1259,6 +1339,126 @@
     </w:sectPr>
   </w:body>
 </w:document>
+</file>
+
+<file path=word/numbering.xml><?xml version="1.0" encoding="utf-8"?>
+<w:numbering xmlns:wpc="http://schemas.microsoft.com/office/word/2010/wordprocessingCanvas" xmlns:cx="http://schemas.microsoft.com/office/drawing/2014/chartex" xmlns:cx1="http://schemas.microsoft.com/office/drawing/2015/9/8/chartex" xmlns:cx2="http://schemas.microsoft.com/office/drawing/2015/10/21/chartex" xmlns:cx3="http://schemas.microsoft.com/office/drawing/2016/5/9/chartex" xmlns:cx4="http://schemas.microsoft.com/office/drawing/2016/5/10/chartex" xmlns:cx5="http://schemas.microsoft.com/office/drawing/2016/5/11/chartex" xmlns:cx6="http://schemas.microsoft.com/office/drawing/2016/5/12/chartex" xmlns:cx7="http://schemas.microsoft.com/office/drawing/2016/5/13/chartex" xmlns:cx8="http://schemas.microsoft.com/office/drawing/2016/5/14/chartex" xmlns:mc="http://schemas.openxmlformats.org/markup-compatibility/2006" xmlns:aink="http://schemas.microsoft.com/office/drawing/2016/ink" xmlns:am3d="http://schemas.microsoft.com/office/drawing/2017/model3d" xmlns:o="urn:schemas-microsoft-com:office:office" xmlns:oel="http://schemas.microsoft.com/office/2019/extlst" xmlns:r="http://schemas.openxmlformats.org/officeDocument/2006/relationships" xmlns:m="http://schemas.openxmlformats.org/officeDocument/2006/math" xmlns:v="urn:schemas-microsoft-com:vml" xmlns:wp14="http://schemas.microsoft.com/office/word/2010/wordprocessingDrawing" xmlns:wp="http://schemas.openxmlformats.org/drawingml/2006/wordprocessingDrawing" xmlns:w10="urn:schemas-microsoft-com:office:word" xmlns:w="http://schemas.openxmlformats.org/wordprocessingml/2006/main" xmlns:w14="http://schemas.microsoft.com/office/word/2010/wordml" xmlns:w15="http://schemas.microsoft.com/office/word/2012/wordml" xmlns:w16cex="http://schemas.microsoft.com/office/word/2018/wordml/cex" xmlns:w16cid="http://schemas.microsoft.com/office/word/2016/wordml/cid" xmlns:w16="http://schemas.microsoft.com/office/word/2018/wordml" xmlns:w16du="http://schemas.microsoft.com/office/word/2023/wordml/word16du" xmlns:w16sdtdh="http://schemas.microsoft.com/office/word/2020/wordml/sdtdatahash" xmlns:w16sdtfl="http://schemas.microsoft.com/office/word/2024/wordml/sdtformatlock" xmlns:w16se="http://schemas.microsoft.com/office/word/2015/wordml/symex" xmlns:wpg="http://schemas.microsoft.com/office/word/2010/wordprocessingGroup" xmlns:wpi="http://schemas.microsoft.com/office/word/2010/wordprocessingInk" xmlns:wne="http://schemas.microsoft.com/office/word/2006/wordml" xmlns:wps="http://schemas.microsoft.com/office/word/2010/wordprocessingShape" mc:Ignorable="w14 w15 w16se w16cid w16 w16cex w16sdtdh w16sdtfl w16du wp14">
+  <w:abstractNum w:abstractNumId="0" w15:restartNumberingAfterBreak="0">
+    <w:nsid w:val="28D77BDF"/>
+    <w:multiLevelType w:val="hybridMultilevel"/>
+    <w:tmpl w:val="7E9A5444"/>
+    <w:lvl w:ilvl="0" w:tplc="2C923250">
+      <w:numFmt w:val="bullet"/>
+      <w:lvlText w:val="-"/>
+      <w:lvlJc w:val="left"/>
+      <w:pPr>
+        <w:ind w:left="720" w:hanging="360"/>
+      </w:pPr>
+      <w:rPr>
+        <w:rFonts w:ascii="Calibri" w:eastAsiaTheme="minorHAnsi" w:hAnsi="Calibri" w:cs="Calibri" w:hint="default"/>
+      </w:rPr>
+    </w:lvl>
+    <w:lvl w:ilvl="1" w:tplc="2C0A0003">
+      <w:start w:val="1"/>
+      <w:numFmt w:val="bullet"/>
+      <w:lvlText w:val="o"/>
+      <w:lvlJc w:val="left"/>
+      <w:pPr>
+        <w:ind w:left="1440" w:hanging="360"/>
+      </w:pPr>
+      <w:rPr>
+        <w:rFonts w:ascii="Courier New" w:hAnsi="Courier New" w:cs="Courier New" w:hint="default"/>
+      </w:rPr>
+    </w:lvl>
+    <w:lvl w:ilvl="2" w:tplc="2C0A0005" w:tentative="1">
+      <w:start w:val="1"/>
+      <w:numFmt w:val="bullet"/>
+      <w:lvlText w:val=""/>
+      <w:lvlJc w:val="left"/>
+      <w:pPr>
+        <w:ind w:left="2160" w:hanging="360"/>
+      </w:pPr>
+      <w:rPr>
+        <w:rFonts w:ascii="Wingdings" w:hAnsi="Wingdings" w:hint="default"/>
+      </w:rPr>
+    </w:lvl>
+    <w:lvl w:ilvl="3" w:tplc="2C0A0001" w:tentative="1">
+      <w:start w:val="1"/>
+      <w:numFmt w:val="bullet"/>
+      <w:lvlText w:val=""/>
+      <w:lvlJc w:val="left"/>
+      <w:pPr>
+        <w:ind w:left="2880" w:hanging="360"/>
+      </w:pPr>
+      <w:rPr>
+        <w:rFonts w:ascii="Symbol" w:hAnsi="Symbol" w:hint="default"/>
+      </w:rPr>
+    </w:lvl>
+    <w:lvl w:ilvl="4" w:tplc="2C0A0003" w:tentative="1">
+      <w:start w:val="1"/>
+      <w:numFmt w:val="bullet"/>
+      <w:lvlText w:val="o"/>
+      <w:lvlJc w:val="left"/>
+      <w:pPr>
+        <w:ind w:left="3600" w:hanging="360"/>
+      </w:pPr>
+      <w:rPr>
+        <w:rFonts w:ascii="Courier New" w:hAnsi="Courier New" w:cs="Courier New" w:hint="default"/>
+      </w:rPr>
+    </w:lvl>
+    <w:lvl w:ilvl="5" w:tplc="2C0A0005" w:tentative="1">
+      <w:start w:val="1"/>
+      <w:numFmt w:val="bullet"/>
+      <w:lvlText w:val=""/>
+      <w:lvlJc w:val="left"/>
+      <w:pPr>
+        <w:ind w:left="4320" w:hanging="360"/>
+      </w:pPr>
+      <w:rPr>
+        <w:rFonts w:ascii="Wingdings" w:hAnsi="Wingdings" w:hint="default"/>
+      </w:rPr>
+    </w:lvl>
+    <w:lvl w:ilvl="6" w:tplc="2C0A0001" w:tentative="1">
+      <w:start w:val="1"/>
+      <w:numFmt w:val="bullet"/>
+      <w:lvlText w:val=""/>
+      <w:lvlJc w:val="left"/>
+      <w:pPr>
+        <w:ind w:left="5040" w:hanging="360"/>
+      </w:pPr>
+      <w:rPr>
+        <w:rFonts w:ascii="Symbol" w:hAnsi="Symbol" w:hint="default"/>
+      </w:rPr>
+    </w:lvl>
+    <w:lvl w:ilvl="7" w:tplc="2C0A0003" w:tentative="1">
+      <w:start w:val="1"/>
+      <w:numFmt w:val="bullet"/>
+      <w:lvlText w:val="o"/>
+      <w:lvlJc w:val="left"/>
+      <w:pPr>
+        <w:ind w:left="5760" w:hanging="360"/>
+      </w:pPr>
+      <w:rPr>
+        <w:rFonts w:ascii="Courier New" w:hAnsi="Courier New" w:cs="Courier New" w:hint="default"/>
+      </w:rPr>
+    </w:lvl>
+    <w:lvl w:ilvl="8" w:tplc="2C0A0005" w:tentative="1">
+      <w:start w:val="1"/>
+      <w:numFmt w:val="bullet"/>
+      <w:lvlText w:val=""/>
+      <w:lvlJc w:val="left"/>
+      <w:pPr>
+        <w:ind w:left="6480" w:hanging="360"/>
+      </w:pPr>
+      <w:rPr>
+        <w:rFonts w:ascii="Wingdings" w:hAnsi="Wingdings" w:hint="default"/>
+      </w:rPr>
+    </w:lvl>
+  </w:abstractNum>
+  <w:num w:numId="1" w16cid:durableId="440105545">
+    <w:abstractNumId w:val="0"/>
+  </w:num>
+</w:numbering>
 </file>
 
 <file path=word/styles.xml><?xml version="1.0" encoding="utf-8"?>
@@ -1711,7 +1911,6 @@
     <w:next w:val="Normal"/>
     <w:link w:val="Heading3Char"/>
     <w:uiPriority w:val="9"/>
-    <w:semiHidden/>
     <w:unhideWhenUsed/>
     <w:qFormat/>
     <w:rsid w:val="008649E1"/>
@@ -1918,7 +2117,6 @@
     <w:basedOn w:val="DefaultParagraphFont"/>
     <w:link w:val="Heading3"/>
     <w:uiPriority w:val="9"/>
-    <w:semiHidden/>
     <w:rsid w:val="008649E1"/>
     <w:rPr>
       <w:rFonts w:eastAsiaTheme="majorEastAsia" w:cstheme="majorBidi"/>

</xml_diff>

<commit_message>
working and on timegit add .git add .!
</commit_message>
<xml_diff>
--- a/FCR.docx
+++ b/FCR.docx
@@ -153,8 +153,13 @@
         <w:t>Fine</w:t>
       </w:r>
       <w:r>
-        <w:t xml:space="preserve"> Carrier Recovery</w:t>
-      </w:r>
+        <w:t xml:space="preserve"> Carrier </w:t>
+      </w:r>
+      <w:proofErr w:type="spellStart"/>
+      <w:r>
+        <w:t>Recovery</w:t>
+      </w:r>
+      <w:proofErr w:type="spellEnd"/>
     </w:p>
     <w:p>
       <w:r>
@@ -188,7 +193,7 @@
                     <pic:cNvPicPr/>
                   </pic:nvPicPr>
                   <pic:blipFill>
-                    <a:blip r:embed="rId5"/>
+                    <a:blip r:embed="rId4"/>
                     <a:stretch>
                       <a:fillRect/>
                     </a:stretch>
@@ -225,15 +230,44 @@
         </w:r>
       </w:fldSimple>
       <w:r>
-        <w:t xml:space="preserve"> Tx, canal y Rx</w:t>
-      </w:r>
+        <w:t xml:space="preserve"> </w:t>
+      </w:r>
+      <w:proofErr w:type="spellStart"/>
+      <w:r>
+        <w:t>Tx</w:t>
+      </w:r>
+      <w:proofErr w:type="spellEnd"/>
+      <w:r>
+        <w:t xml:space="preserve">, canal y </w:t>
+      </w:r>
+      <w:proofErr w:type="spellStart"/>
+      <w:r>
+        <w:t>Rx</w:t>
+      </w:r>
+      <w:proofErr w:type="spellEnd"/>
     </w:p>
     <w:p>
       <w:r>
         <w:t xml:space="preserve">Donde </w:t>
       </w:r>
       <w:r>
-        <w:t>en el caso ideal, el up converter se “cancela” con el downconverter y tenemos los símbolos transmitidos en el receptor.</w:t>
+        <w:t xml:space="preserve">en el caso ideal, el up </w:t>
+      </w:r>
+      <w:proofErr w:type="spellStart"/>
+      <w:r>
+        <w:t>converter</w:t>
+      </w:r>
+      <w:proofErr w:type="spellEnd"/>
+      <w:r>
+        <w:t xml:space="preserve"> se “cancela” con el </w:t>
+      </w:r>
+      <w:proofErr w:type="spellStart"/>
+      <w:r>
+        <w:t>downconverter</w:t>
+      </w:r>
+      <w:proofErr w:type="spellEnd"/>
+      <w:r>
+        <w:t xml:space="preserve"> y tenemos los símbolos transmitidos en el receptor.</w:t>
       </w:r>
     </w:p>
     <w:p>
@@ -246,8 +280,13 @@
       <w:r>
         <w:t xml:space="preserve">existe un desfasaje entre ambos osciladores, por lo </w:t>
       </w:r>
-      <w:r>
-        <w:t>que en el receptor, en vez de tener los símbolos transmitidos, tenemos lo siguiente.</w:t>
+      <w:proofErr w:type="gramStart"/>
+      <w:r>
+        <w:t>que</w:t>
+      </w:r>
+      <w:proofErr w:type="gramEnd"/>
+      <w:r>
+        <w:t xml:space="preserve"> en el receptor, en vez de tener los símbolos transmitidos, tenemos lo siguiente.</w:t>
       </w:r>
     </w:p>
     <w:p>
@@ -271,7 +310,7 @@
                     <pic:cNvPicPr/>
                   </pic:nvPicPr>
                   <pic:blipFill>
-                    <a:blip r:embed="rId6"/>
+                    <a:blip r:embed="rId5"/>
                     <a:stretch>
                       <a:fillRect/>
                     </a:stretch>
@@ -299,9 +338,35 @@
       <w:r>
         <w:t>“</w:t>
       </w:r>
-      <w:r>
-        <w:t>decision directed carrier recovery</w:t>
-      </w:r>
+      <w:proofErr w:type="spellStart"/>
+      <w:r>
+        <w:t>decision</w:t>
+      </w:r>
+      <w:proofErr w:type="spellEnd"/>
+      <w:r>
+        <w:t xml:space="preserve"> </w:t>
+      </w:r>
+      <w:proofErr w:type="spellStart"/>
+      <w:r>
+        <w:t>directed</w:t>
+      </w:r>
+      <w:proofErr w:type="spellEnd"/>
+      <w:r>
+        <w:t xml:space="preserve"> </w:t>
+      </w:r>
+      <w:proofErr w:type="spellStart"/>
+      <w:r>
+        <w:t>carrier</w:t>
+      </w:r>
+      <w:proofErr w:type="spellEnd"/>
+      <w:r>
+        <w:t xml:space="preserve"> </w:t>
+      </w:r>
+      <w:proofErr w:type="spellStart"/>
+      <w:r>
+        <w:t>recovery</w:t>
+      </w:r>
+      <w:proofErr w:type="spellEnd"/>
       <w:r>
         <w:t>”</w:t>
       </w:r>
@@ -345,7 +410,7 @@
                     <pic:cNvPicPr/>
                   </pic:nvPicPr>
                   <pic:blipFill>
-                    <a:blip r:embed="rId7"/>
+                    <a:blip r:embed="rId6"/>
                     <a:stretch>
                       <a:fillRect/>
                     </a:stretch>
@@ -369,13 +434,37 @@
     <w:p>
       <w:r>
         <w:lastRenderedPageBreak/>
-        <w:t>Vemos que el sistema usa un pll para calcular la diferencia de fase y corregirla</w:t>
+        <w:t xml:space="preserve">Vemos que el sistema usa un </w:t>
+      </w:r>
+      <w:proofErr w:type="spellStart"/>
+      <w:r>
+        <w:t>pll</w:t>
+      </w:r>
+      <w:proofErr w:type="spellEnd"/>
+      <w:r>
+        <w:t xml:space="preserve"> para calcular la diferencia de fase y corregirla</w:t>
       </w:r>
       <w:r>
         <w:t xml:space="preserve">. Este PLL es de tipo dos debido a que la estimación de fase es una rampa (la fase de entrada es un escalón) por lo que </w:t>
       </w:r>
       <w:r>
-        <w:t>el pll tipo dos es capaz de seguir sin error de estado estacionario.</w:t>
+        <w:t xml:space="preserve">el </w:t>
+      </w:r>
+      <w:proofErr w:type="spellStart"/>
+      <w:r>
+        <w:t>pll</w:t>
+      </w:r>
+      <w:proofErr w:type="spellEnd"/>
+      <w:r>
+        <w:t xml:space="preserve"> tipo dos es </w:t>
+      </w:r>
+      <w:proofErr w:type="gramStart"/>
+      <w:r>
+        <w:t>capaz</w:t>
+      </w:r>
+      <w:proofErr w:type="gramEnd"/>
+      <w:r>
+        <w:t xml:space="preserve"> de seguir sin error de estado estacionario.</w:t>
       </w:r>
       <w:r>
         <w:t xml:space="preserve"> </w:t>
@@ -413,7 +502,7 @@
                     <pic:cNvPicPr/>
                   </pic:nvPicPr>
                   <pic:blipFill>
-                    <a:blip r:embed="rId8"/>
+                    <a:blip r:embed="rId7"/>
                     <a:stretch>
                       <a:fillRect/>
                     </a:stretch>
@@ -460,7 +549,7 @@
                     <pic:cNvPicPr/>
                   </pic:nvPicPr>
                   <pic:blipFill>
-                    <a:blip r:embed="rId9"/>
+                    <a:blip r:embed="rId8"/>
                     <a:stretch>
                       <a:fillRect/>
                     </a:stretch>
@@ -497,8 +586,13 @@
     </w:p>
     <w:p>
       <w:r>
-        <w:t>Test lut</w:t>
-      </w:r>
+        <w:t xml:space="preserve">Test </w:t>
+      </w:r>
+      <w:proofErr w:type="spellStart"/>
+      <w:r>
+        <w:t>lut</w:t>
+      </w:r>
+      <w:proofErr w:type="spellEnd"/>
     </w:p>
     <w:p>
       <w:r>
@@ -521,7 +615,7 @@
                     <pic:cNvPicPr/>
                   </pic:nvPicPr>
                   <pic:blipFill>
-                    <a:blip r:embed="rId10"/>
+                    <a:blip r:embed="rId9"/>
                     <a:stretch>
                       <a:fillRect/>
                     </a:stretch>
@@ -557,14 +651,23 @@
       </w:r>
     </w:p>
     <w:p>
-      <w:r>
-        <w:t>Fcr_high_level_fxp.ipynb</w:t>
-      </w:r>
-    </w:p>
-    <w:p>
+      <w:proofErr w:type="spellStart"/>
+      <w:r>
+        <w:t>Fcr_high_level_</w:t>
+      </w:r>
+      <w:proofErr w:type="gramStart"/>
+      <w:r>
+        <w:t>fxp.ipynb</w:t>
+      </w:r>
+      <w:proofErr w:type="spellEnd"/>
+      <w:proofErr w:type="gramEnd"/>
+    </w:p>
+    <w:p>
+      <w:proofErr w:type="spellStart"/>
       <w:r>
         <w:t>Tx</w:t>
       </w:r>
+      <w:proofErr w:type="spellEnd"/>
     </w:p>
     <w:p>
       <w:r>
@@ -587,7 +690,7 @@
                     <pic:cNvPicPr/>
                   </pic:nvPicPr>
                   <pic:blipFill>
-                    <a:blip r:embed="rId11"/>
+                    <a:blip r:embed="rId10"/>
                     <a:stretch>
                       <a:fillRect/>
                     </a:stretch>
@@ -627,7 +730,7 @@
                     <pic:cNvPicPr/>
                   </pic:nvPicPr>
                   <pic:blipFill>
-                    <a:blip r:embed="rId12"/>
+                    <a:blip r:embed="rId11"/>
                     <a:stretch>
                       <a:fillRect/>
                     </a:stretch>
@@ -649,9 +752,11 @@
       </w:r>
     </w:p>
     <w:p>
+      <w:proofErr w:type="spellStart"/>
       <w:r>
         <w:t>Rx</w:t>
       </w:r>
+      <w:proofErr w:type="spellEnd"/>
     </w:p>
     <w:p>
       <w:r>
@@ -674,7 +779,7 @@
                     <pic:cNvPicPr/>
                   </pic:nvPicPr>
                   <pic:blipFill>
-                    <a:blip r:embed="rId13"/>
+                    <a:blip r:embed="rId12"/>
                     <a:stretch>
                       <a:fillRect/>
                     </a:stretch>
@@ -714,7 +819,7 @@
                     <pic:cNvPicPr/>
                   </pic:nvPicPr>
                   <pic:blipFill>
-                    <a:blip r:embed="rId14"/>
+                    <a:blip r:embed="rId13"/>
                     <a:stretch>
                       <a:fillRect/>
                     </a:stretch>
@@ -751,9 +856,19 @@
       </w:r>
     </w:p>
     <w:p>
-      <w:r>
-        <w:t>Half LUT and rounding</w:t>
-      </w:r>
+      <w:proofErr w:type="spellStart"/>
+      <w:r>
+        <w:t>Half</w:t>
+      </w:r>
+      <w:proofErr w:type="spellEnd"/>
+      <w:r>
+        <w:t xml:space="preserve"> LUT and </w:t>
+      </w:r>
+      <w:proofErr w:type="spellStart"/>
+      <w:r>
+        <w:t>rounding</w:t>
+      </w:r>
+      <w:proofErr w:type="spellEnd"/>
     </w:p>
     <w:p>
       <w:r>
@@ -776,7 +891,7 @@
                     <pic:cNvPicPr/>
                   </pic:nvPicPr>
                   <pic:blipFill>
-                    <a:blip r:embed="rId15"/>
+                    <a:blip r:embed="rId14"/>
                     <a:stretch>
                       <a:fillRect/>
                     </a:stretch>
@@ -798,8 +913,13 @@
       </w:r>
     </w:p>
     <w:p>
-      <w:r>
-        <w:t>Phase error</w:t>
+      <w:proofErr w:type="spellStart"/>
+      <w:r>
+        <w:t>Phase</w:t>
+      </w:r>
+      <w:proofErr w:type="spellEnd"/>
+      <w:r>
+        <w:t xml:space="preserve"> error</w:t>
       </w:r>
     </w:p>
     <w:p>
@@ -823,7 +943,7 @@
                     <pic:cNvPicPr/>
                   </pic:nvPicPr>
                   <pic:blipFill>
-                    <a:blip r:embed="rId16"/>
+                    <a:blip r:embed="rId15"/>
                     <a:stretch>
                       <a:fillRect/>
                     </a:stretch>
@@ -845,9 +965,11 @@
       </w:r>
     </w:p>
     <w:p>
+      <w:proofErr w:type="spellStart"/>
       <w:r>
         <w:t>Integrator</w:t>
       </w:r>
+      <w:proofErr w:type="spellEnd"/>
     </w:p>
     <w:p>
       <w:r>
@@ -870,7 +992,7 @@
                     <pic:cNvPicPr/>
                   </pic:nvPicPr>
                   <pic:blipFill>
-                    <a:blip r:embed="rId17"/>
+                    <a:blip r:embed="rId16"/>
                     <a:stretch>
                       <a:fillRect/>
                     </a:stretch>
@@ -917,7 +1039,7 @@
                     <pic:cNvPicPr/>
                   </pic:nvPicPr>
                   <pic:blipFill>
-                    <a:blip r:embed="rId18"/>
+                    <a:blip r:embed="rId17"/>
                     <a:stretch>
                       <a:fillRect/>
                     </a:stretch>
@@ -944,10 +1066,20 @@
       </w:r>
     </w:p>
     <w:p>
+      <w:proofErr w:type="spellStart"/>
       <w:r>
         <w:lastRenderedPageBreak/>
-        <w:t>Half LUT truncating</w:t>
-      </w:r>
+        <w:t>Half</w:t>
+      </w:r>
+      <w:proofErr w:type="spellEnd"/>
+      <w:r>
+        <w:t xml:space="preserve"> LUT </w:t>
+      </w:r>
+      <w:proofErr w:type="spellStart"/>
+      <w:r>
+        <w:t>truncating</w:t>
+      </w:r>
+      <w:proofErr w:type="spellEnd"/>
     </w:p>
     <w:p>
       <w:r>
@@ -970,7 +1102,7 @@
                     <pic:cNvPicPr/>
                   </pic:nvPicPr>
                   <pic:blipFill>
-                    <a:blip r:embed="rId19"/>
+                    <a:blip r:embed="rId18"/>
                     <a:stretch>
                       <a:fillRect/>
                     </a:stretch>
@@ -1012,7 +1144,7 @@
                     <pic:cNvPicPr/>
                   </pic:nvPicPr>
                   <pic:blipFill>
-                    <a:blip r:embed="rId20"/>
+                    <a:blip r:embed="rId19"/>
                     <a:stretch>
                       <a:fillRect/>
                     </a:stretch>
@@ -1054,7 +1186,7 @@
                     <pic:cNvPicPr/>
                   </pic:nvPicPr>
                   <pic:blipFill>
-                    <a:blip r:embed="rId21"/>
+                    <a:blip r:embed="rId20"/>
                     <a:stretch>
                       <a:fillRect/>
                     </a:stretch>
@@ -1097,7 +1229,7 @@
                     <pic:cNvPicPr/>
                   </pic:nvPicPr>
                   <pic:blipFill>
-                    <a:blip r:embed="rId22"/>
+                    <a:blip r:embed="rId21"/>
                     <a:stretch>
                       <a:fillRect/>
                     </a:stretch>
@@ -1118,218 +1250,6 @@
         </w:drawing>
       </w:r>
     </w:p>
-    <w:p>
-      <w:r>
-        <w:br w:type="page"/>
-      </w:r>
-    </w:p>
-    <w:p>
-      <w:pPr>
-        <w:pStyle w:val="Heading3"/>
-      </w:pPr>
-      <w:r>
-        <w:lastRenderedPageBreak/>
-        <w:t>Cambio de resolucion</w:t>
-      </w:r>
-    </w:p>
-    <w:p>
-      <w:r>
-        <w:t>Todo 8.7</w:t>
-      </w:r>
-    </w:p>
-    <w:p>
-      <w:r>
-        <w:drawing>
-          <wp:inline distT="0" distB="0" distL="0" distR="0" wp14:anchorId="0CCA0953" wp14:editId="78658DD8">
-            <wp:extent cx="5731510" cy="3599180"/>
-            <wp:effectExtent l="0" t="0" r="2540" b="1270"/>
-            <wp:docPr id="2011059648" name="Picture 1"/>
-            <wp:cNvGraphicFramePr>
-              <a:graphicFrameLocks xmlns:a="http://schemas.openxmlformats.org/drawingml/2006/main" noChangeAspect="1"/>
-            </wp:cNvGraphicFramePr>
-            <a:graphic xmlns:a="http://schemas.openxmlformats.org/drawingml/2006/main">
-              <a:graphicData uri="http://schemas.openxmlformats.org/drawingml/2006/picture">
-                <pic:pic xmlns:pic="http://schemas.openxmlformats.org/drawingml/2006/picture">
-                  <pic:nvPicPr>
-                    <pic:cNvPr id="2011059648" name=""/>
-                    <pic:cNvPicPr/>
-                  </pic:nvPicPr>
-                  <pic:blipFill>
-                    <a:blip r:embed="rId23"/>
-                    <a:stretch>
-                      <a:fillRect/>
-                    </a:stretch>
-                  </pic:blipFill>
-                  <pic:spPr>
-                    <a:xfrm>
-                      <a:off x="0" y="0"/>
-                      <a:ext cx="5731510" cy="3599180"/>
-                    </a:xfrm>
-                    <a:prstGeom prst="rect">
-                      <a:avLst/>
-                    </a:prstGeom>
-                  </pic:spPr>
-                </pic:pic>
-              </a:graphicData>
-            </a:graphic>
-          </wp:inline>
-        </w:drawing>
-      </w:r>
-    </w:p>
-    <w:p>
-      <w:r>
-        <w:t>Pero si agrego un registro mas de latencia se rompe</w:t>
-      </w:r>
-    </w:p>
-    <w:p>
-      <w:r>
-        <w:t>Pasos para cambiar resolución:</w:t>
-      </w:r>
-    </w:p>
-    <w:p>
-      <w:pPr>
-        <w:pStyle w:val="ListParagraph"/>
-        <w:numPr>
-          <w:ilvl w:val="0"/>
-          <w:numId w:val="1"/>
-        </w:numPr>
-      </w:pPr>
-      <w:r>
-        <w:t>Cambiar en TB</w:t>
-      </w:r>
-    </w:p>
-    <w:p>
-      <w:pPr>
-        <w:pStyle w:val="ListParagraph"/>
-        <w:numPr>
-          <w:ilvl w:val="0"/>
-          <w:numId w:val="1"/>
-        </w:numPr>
-      </w:pPr>
-      <w:r>
-        <w:t>Cambiar en Carrier recovery top</w:t>
-      </w:r>
-    </w:p>
-    <w:p>
-      <w:pPr>
-        <w:pStyle w:val="ListParagraph"/>
-        <w:numPr>
-          <w:ilvl w:val="0"/>
-          <w:numId w:val="1"/>
-        </w:numPr>
-      </w:pPr>
-      <w:r>
-        <w:t>Cambiar en pase detector</w:t>
-      </w:r>
-    </w:p>
-    <w:p>
-      <w:pPr>
-        <w:pStyle w:val="ListParagraph"/>
-        <w:numPr>
-          <w:ilvl w:val="1"/>
-          <w:numId w:val="1"/>
-        </w:numPr>
-      </w:pPr>
-      <w:r>
-        <w:t>Resoluciones y PI</w:t>
-      </w:r>
-    </w:p>
-    <w:p>
-      <w:pPr>
-        <w:pStyle w:val="ListParagraph"/>
-        <w:numPr>
-          <w:ilvl w:val="1"/>
-          <w:numId w:val="1"/>
-        </w:numPr>
-      </w:pPr>
-      <w:r>
-        <w:t>Cambiar ram</w:t>
-      </w:r>
-    </w:p>
-    <w:p>
-      <w:pPr>
-        <w:pStyle w:val="ListParagraph"/>
-        <w:numPr>
-          <w:ilvl w:val="0"/>
-          <w:numId w:val="1"/>
-        </w:numPr>
-      </w:pPr>
-      <w:r>
-        <w:t>Cambiar la lut</w:t>
-      </w:r>
-    </w:p>
-    <w:p>
-      <w:pPr>
-        <w:pStyle w:val="ListParagraph"/>
-        <w:numPr>
-          <w:ilvl w:val="1"/>
-          <w:numId w:val="1"/>
-        </w:numPr>
-      </w:pPr>
-      <w:r>
-        <w:t>Correr mem to coe</w:t>
-      </w:r>
-    </w:p>
-    <w:p>
-      <w:pPr>
-        <w:pStyle w:val="ListParagraph"/>
-        <w:numPr>
-          <w:ilvl w:val="0"/>
-          <w:numId w:val="1"/>
-        </w:numPr>
-      </w:pPr>
-      <w:r>
-        <w:t>Cambiar loop filter</w:t>
-      </w:r>
-    </w:p>
-    <w:p>
-      <w:pPr>
-        <w:pStyle w:val="ListParagraph"/>
-        <w:numPr>
-          <w:ilvl w:val="1"/>
-          <w:numId w:val="1"/>
-        </w:numPr>
-      </w:pPr>
-      <w:r>
-        <w:t>Cambiar constantes</w:t>
-      </w:r>
-    </w:p>
-    <w:p>
-      <w:pPr>
-        <w:pStyle w:val="ListParagraph"/>
-        <w:numPr>
-          <w:ilvl w:val="0"/>
-          <w:numId w:val="1"/>
-        </w:numPr>
-      </w:pPr>
-      <w:r>
-        <w:t>Cambiar vco</w:t>
-      </w:r>
-    </w:p>
-    <w:p>
-      <w:pPr>
-        <w:pStyle w:val="ListParagraph"/>
-        <w:numPr>
-          <w:ilvl w:val="0"/>
-          <w:numId w:val="1"/>
-        </w:numPr>
-      </w:pPr>
-      <w:r>
-        <w:t>Cambiar sin and cos</w:t>
-      </w:r>
-    </w:p>
-    <w:p>
-      <w:pPr>
-        <w:pStyle w:val="ListParagraph"/>
-        <w:numPr>
-          <w:ilvl w:val="1"/>
-          <w:numId w:val="1"/>
-        </w:numPr>
-      </w:pPr>
-      <w:r>
-        <w:t>Cambiar ram</w:t>
-      </w:r>
-    </w:p>
     <w:p/>
     <w:sectPr>
       <w:pgSz w:w="11906" w:h="16838"/>
@@ -1339,126 +1259,6 @@
     </w:sectPr>
   </w:body>
 </w:document>
-</file>
-
-<file path=word/numbering.xml><?xml version="1.0" encoding="utf-8"?>
-<w:numbering xmlns:wpc="http://schemas.microsoft.com/office/word/2010/wordprocessingCanvas" xmlns:cx="http://schemas.microsoft.com/office/drawing/2014/chartex" xmlns:cx1="http://schemas.microsoft.com/office/drawing/2015/9/8/chartex" xmlns:cx2="http://schemas.microsoft.com/office/drawing/2015/10/21/chartex" xmlns:cx3="http://schemas.microsoft.com/office/drawing/2016/5/9/chartex" xmlns:cx4="http://schemas.microsoft.com/office/drawing/2016/5/10/chartex" xmlns:cx5="http://schemas.microsoft.com/office/drawing/2016/5/11/chartex" xmlns:cx6="http://schemas.microsoft.com/office/drawing/2016/5/12/chartex" xmlns:cx7="http://schemas.microsoft.com/office/drawing/2016/5/13/chartex" xmlns:cx8="http://schemas.microsoft.com/office/drawing/2016/5/14/chartex" xmlns:mc="http://schemas.openxmlformats.org/markup-compatibility/2006" xmlns:aink="http://schemas.microsoft.com/office/drawing/2016/ink" xmlns:am3d="http://schemas.microsoft.com/office/drawing/2017/model3d" xmlns:o="urn:schemas-microsoft-com:office:office" xmlns:oel="http://schemas.microsoft.com/office/2019/extlst" xmlns:r="http://schemas.openxmlformats.org/officeDocument/2006/relationships" xmlns:m="http://schemas.openxmlformats.org/officeDocument/2006/math" xmlns:v="urn:schemas-microsoft-com:vml" xmlns:wp14="http://schemas.microsoft.com/office/word/2010/wordprocessingDrawing" xmlns:wp="http://schemas.openxmlformats.org/drawingml/2006/wordprocessingDrawing" xmlns:w10="urn:schemas-microsoft-com:office:word" xmlns:w="http://schemas.openxmlformats.org/wordprocessingml/2006/main" xmlns:w14="http://schemas.microsoft.com/office/word/2010/wordml" xmlns:w15="http://schemas.microsoft.com/office/word/2012/wordml" xmlns:w16cex="http://schemas.microsoft.com/office/word/2018/wordml/cex" xmlns:w16cid="http://schemas.microsoft.com/office/word/2016/wordml/cid" xmlns:w16="http://schemas.microsoft.com/office/word/2018/wordml" xmlns:w16du="http://schemas.microsoft.com/office/word/2023/wordml/word16du" xmlns:w16sdtdh="http://schemas.microsoft.com/office/word/2020/wordml/sdtdatahash" xmlns:w16sdtfl="http://schemas.microsoft.com/office/word/2024/wordml/sdtformatlock" xmlns:w16se="http://schemas.microsoft.com/office/word/2015/wordml/symex" xmlns:wpg="http://schemas.microsoft.com/office/word/2010/wordprocessingGroup" xmlns:wpi="http://schemas.microsoft.com/office/word/2010/wordprocessingInk" xmlns:wne="http://schemas.microsoft.com/office/word/2006/wordml" xmlns:wps="http://schemas.microsoft.com/office/word/2010/wordprocessingShape" mc:Ignorable="w14 w15 w16se w16cid w16 w16cex w16sdtdh w16sdtfl w16du wp14">
-  <w:abstractNum w:abstractNumId="0" w15:restartNumberingAfterBreak="0">
-    <w:nsid w:val="28D77BDF"/>
-    <w:multiLevelType w:val="hybridMultilevel"/>
-    <w:tmpl w:val="7E9A5444"/>
-    <w:lvl w:ilvl="0" w:tplc="2C923250">
-      <w:numFmt w:val="bullet"/>
-      <w:lvlText w:val="-"/>
-      <w:lvlJc w:val="left"/>
-      <w:pPr>
-        <w:ind w:left="720" w:hanging="360"/>
-      </w:pPr>
-      <w:rPr>
-        <w:rFonts w:ascii="Calibri" w:eastAsiaTheme="minorHAnsi" w:hAnsi="Calibri" w:cs="Calibri" w:hint="default"/>
-      </w:rPr>
-    </w:lvl>
-    <w:lvl w:ilvl="1" w:tplc="2C0A0003">
-      <w:start w:val="1"/>
-      <w:numFmt w:val="bullet"/>
-      <w:lvlText w:val="o"/>
-      <w:lvlJc w:val="left"/>
-      <w:pPr>
-        <w:ind w:left="1440" w:hanging="360"/>
-      </w:pPr>
-      <w:rPr>
-        <w:rFonts w:ascii="Courier New" w:hAnsi="Courier New" w:cs="Courier New" w:hint="default"/>
-      </w:rPr>
-    </w:lvl>
-    <w:lvl w:ilvl="2" w:tplc="2C0A0005" w:tentative="1">
-      <w:start w:val="1"/>
-      <w:numFmt w:val="bullet"/>
-      <w:lvlText w:val=""/>
-      <w:lvlJc w:val="left"/>
-      <w:pPr>
-        <w:ind w:left="2160" w:hanging="360"/>
-      </w:pPr>
-      <w:rPr>
-        <w:rFonts w:ascii="Wingdings" w:hAnsi="Wingdings" w:hint="default"/>
-      </w:rPr>
-    </w:lvl>
-    <w:lvl w:ilvl="3" w:tplc="2C0A0001" w:tentative="1">
-      <w:start w:val="1"/>
-      <w:numFmt w:val="bullet"/>
-      <w:lvlText w:val=""/>
-      <w:lvlJc w:val="left"/>
-      <w:pPr>
-        <w:ind w:left="2880" w:hanging="360"/>
-      </w:pPr>
-      <w:rPr>
-        <w:rFonts w:ascii="Symbol" w:hAnsi="Symbol" w:hint="default"/>
-      </w:rPr>
-    </w:lvl>
-    <w:lvl w:ilvl="4" w:tplc="2C0A0003" w:tentative="1">
-      <w:start w:val="1"/>
-      <w:numFmt w:val="bullet"/>
-      <w:lvlText w:val="o"/>
-      <w:lvlJc w:val="left"/>
-      <w:pPr>
-        <w:ind w:left="3600" w:hanging="360"/>
-      </w:pPr>
-      <w:rPr>
-        <w:rFonts w:ascii="Courier New" w:hAnsi="Courier New" w:cs="Courier New" w:hint="default"/>
-      </w:rPr>
-    </w:lvl>
-    <w:lvl w:ilvl="5" w:tplc="2C0A0005" w:tentative="1">
-      <w:start w:val="1"/>
-      <w:numFmt w:val="bullet"/>
-      <w:lvlText w:val=""/>
-      <w:lvlJc w:val="left"/>
-      <w:pPr>
-        <w:ind w:left="4320" w:hanging="360"/>
-      </w:pPr>
-      <w:rPr>
-        <w:rFonts w:ascii="Wingdings" w:hAnsi="Wingdings" w:hint="default"/>
-      </w:rPr>
-    </w:lvl>
-    <w:lvl w:ilvl="6" w:tplc="2C0A0001" w:tentative="1">
-      <w:start w:val="1"/>
-      <w:numFmt w:val="bullet"/>
-      <w:lvlText w:val=""/>
-      <w:lvlJc w:val="left"/>
-      <w:pPr>
-        <w:ind w:left="5040" w:hanging="360"/>
-      </w:pPr>
-      <w:rPr>
-        <w:rFonts w:ascii="Symbol" w:hAnsi="Symbol" w:hint="default"/>
-      </w:rPr>
-    </w:lvl>
-    <w:lvl w:ilvl="7" w:tplc="2C0A0003" w:tentative="1">
-      <w:start w:val="1"/>
-      <w:numFmt w:val="bullet"/>
-      <w:lvlText w:val="o"/>
-      <w:lvlJc w:val="left"/>
-      <w:pPr>
-        <w:ind w:left="5760" w:hanging="360"/>
-      </w:pPr>
-      <w:rPr>
-        <w:rFonts w:ascii="Courier New" w:hAnsi="Courier New" w:cs="Courier New" w:hint="default"/>
-      </w:rPr>
-    </w:lvl>
-    <w:lvl w:ilvl="8" w:tplc="2C0A0005" w:tentative="1">
-      <w:start w:val="1"/>
-      <w:numFmt w:val="bullet"/>
-      <w:lvlText w:val=""/>
-      <w:lvlJc w:val="left"/>
-      <w:pPr>
-        <w:ind w:left="6480" w:hanging="360"/>
-      </w:pPr>
-      <w:rPr>
-        <w:rFonts w:ascii="Wingdings" w:hAnsi="Wingdings" w:hint="default"/>
-      </w:rPr>
-    </w:lvl>
-  </w:abstractNum>
-  <w:num w:numId="1" w16cid:durableId="440105545">
-    <w:abstractNumId w:val="0"/>
-  </w:num>
-</w:numbering>
 </file>
 
 <file path=word/styles.xml><?xml version="1.0" encoding="utf-8"?>
@@ -1911,6 +1711,7 @@
     <w:next w:val="Normal"/>
     <w:link w:val="Heading3Char"/>
     <w:uiPriority w:val="9"/>
+    <w:semiHidden/>
     <w:unhideWhenUsed/>
     <w:qFormat/>
     <w:rsid w:val="008649E1"/>
@@ -2117,6 +1918,7 @@
     <w:basedOn w:val="DefaultParagraphFont"/>
     <w:link w:val="Heading3"/>
     <w:uiPriority w:val="9"/>
+    <w:semiHidden/>
     <w:rsid w:val="008649E1"/>
     <w:rPr>
       <w:rFonts w:eastAsiaTheme="majorEastAsia" w:cstheme="majorBidi"/>

</xml_diff>

<commit_message>
about to test in board
</commit_message>
<xml_diff>
--- a/FCR.docx
+++ b/FCR.docx
@@ -153,13 +153,8 @@
         <w:t>Fine</w:t>
       </w:r>
       <w:r>
-        <w:t xml:space="preserve"> Carrier </w:t>
-      </w:r>
-      <w:proofErr w:type="spellStart"/>
-      <w:r>
-        <w:t>Recovery</w:t>
-      </w:r>
-      <w:proofErr w:type="spellEnd"/>
+        <w:t xml:space="preserve"> Carrier Recovery</w:t>
+      </w:r>
     </w:p>
     <w:p>
       <w:r>
@@ -230,44 +225,15 @@
         </w:r>
       </w:fldSimple>
       <w:r>
-        <w:t xml:space="preserve"> </w:t>
-      </w:r>
-      <w:proofErr w:type="spellStart"/>
-      <w:r>
-        <w:t>Tx</w:t>
-      </w:r>
-      <w:proofErr w:type="spellEnd"/>
-      <w:r>
-        <w:t xml:space="preserve">, canal y </w:t>
-      </w:r>
-      <w:proofErr w:type="spellStart"/>
-      <w:r>
-        <w:t>Rx</w:t>
-      </w:r>
-      <w:proofErr w:type="spellEnd"/>
+        <w:t xml:space="preserve"> Tx, canal y Rx</w:t>
+      </w:r>
     </w:p>
     <w:p>
       <w:r>
         <w:t xml:space="preserve">Donde </w:t>
       </w:r>
       <w:r>
-        <w:t xml:space="preserve">en el caso ideal, el up </w:t>
-      </w:r>
-      <w:proofErr w:type="spellStart"/>
-      <w:r>
-        <w:t>converter</w:t>
-      </w:r>
-      <w:proofErr w:type="spellEnd"/>
-      <w:r>
-        <w:t xml:space="preserve"> se “cancela” con el </w:t>
-      </w:r>
-      <w:proofErr w:type="spellStart"/>
-      <w:r>
-        <w:t>downconverter</w:t>
-      </w:r>
-      <w:proofErr w:type="spellEnd"/>
-      <w:r>
-        <w:t xml:space="preserve"> y tenemos los símbolos transmitidos en el receptor.</w:t>
+        <w:t>en el caso ideal, el up converter se “cancela” con el downconverter y tenemos los símbolos transmitidos en el receptor.</w:t>
       </w:r>
     </w:p>
     <w:p>
@@ -280,13 +246,8 @@
       <w:r>
         <w:t xml:space="preserve">existe un desfasaje entre ambos osciladores, por lo </w:t>
       </w:r>
-      <w:proofErr w:type="gramStart"/>
-      <w:r>
-        <w:t>que</w:t>
-      </w:r>
-      <w:proofErr w:type="gramEnd"/>
-      <w:r>
-        <w:t xml:space="preserve"> en el receptor, en vez de tener los símbolos transmitidos, tenemos lo siguiente.</w:t>
+      <w:r>
+        <w:t>que en el receptor, en vez de tener los símbolos transmitidos, tenemos lo siguiente.</w:t>
       </w:r>
     </w:p>
     <w:p>
@@ -338,35 +299,9 @@
       <w:r>
         <w:t>“</w:t>
       </w:r>
-      <w:proofErr w:type="spellStart"/>
-      <w:r>
-        <w:t>decision</w:t>
-      </w:r>
-      <w:proofErr w:type="spellEnd"/>
-      <w:r>
-        <w:t xml:space="preserve"> </w:t>
-      </w:r>
-      <w:proofErr w:type="spellStart"/>
-      <w:r>
-        <w:t>directed</w:t>
-      </w:r>
-      <w:proofErr w:type="spellEnd"/>
-      <w:r>
-        <w:t xml:space="preserve"> </w:t>
-      </w:r>
-      <w:proofErr w:type="spellStart"/>
-      <w:r>
-        <w:t>carrier</w:t>
-      </w:r>
-      <w:proofErr w:type="spellEnd"/>
-      <w:r>
-        <w:t xml:space="preserve"> </w:t>
-      </w:r>
-      <w:proofErr w:type="spellStart"/>
-      <w:r>
-        <w:t>recovery</w:t>
-      </w:r>
-      <w:proofErr w:type="spellEnd"/>
+      <w:r>
+        <w:t>decision directed carrier recovery</w:t>
+      </w:r>
       <w:r>
         <w:t>”</w:t>
       </w:r>
@@ -434,37 +369,13 @@
     <w:p>
       <w:r>
         <w:lastRenderedPageBreak/>
-        <w:t xml:space="preserve">Vemos que el sistema usa un </w:t>
-      </w:r>
-      <w:proofErr w:type="spellStart"/>
-      <w:r>
-        <w:t>pll</w:t>
-      </w:r>
-      <w:proofErr w:type="spellEnd"/>
-      <w:r>
-        <w:t xml:space="preserve"> para calcular la diferencia de fase y corregirla</w:t>
+        <w:t>Vemos que el sistema usa un pll para calcular la diferencia de fase y corregirla</w:t>
       </w:r>
       <w:r>
         <w:t xml:space="preserve">. Este PLL es de tipo dos debido a que la estimación de fase es una rampa (la fase de entrada es un escalón) por lo que </w:t>
       </w:r>
       <w:r>
-        <w:t xml:space="preserve">el </w:t>
-      </w:r>
-      <w:proofErr w:type="spellStart"/>
-      <w:r>
-        <w:t>pll</w:t>
-      </w:r>
-      <w:proofErr w:type="spellEnd"/>
-      <w:r>
-        <w:t xml:space="preserve"> tipo dos es </w:t>
-      </w:r>
-      <w:proofErr w:type="gramStart"/>
-      <w:r>
-        <w:t>capaz</w:t>
-      </w:r>
-      <w:proofErr w:type="gramEnd"/>
-      <w:r>
-        <w:t xml:space="preserve"> de seguir sin error de estado estacionario.</w:t>
+        <w:t>el pll tipo dos es capaz de seguir sin error de estado estacionario.</w:t>
       </w:r>
       <w:r>
         <w:t xml:space="preserve"> </w:t>
@@ -586,13 +497,8 @@
     </w:p>
     <w:p>
       <w:r>
-        <w:t xml:space="preserve">Test </w:t>
-      </w:r>
-      <w:proofErr w:type="spellStart"/>
-      <w:r>
-        <w:t>lut</w:t>
-      </w:r>
-      <w:proofErr w:type="spellEnd"/>
+        <w:t>Test lut</w:t>
+      </w:r>
     </w:p>
     <w:p>
       <w:r>
@@ -651,23 +557,14 @@
       </w:r>
     </w:p>
     <w:p>
-      <w:proofErr w:type="spellStart"/>
-      <w:r>
-        <w:t>Fcr_high_level_</w:t>
-      </w:r>
-      <w:proofErr w:type="gramStart"/>
-      <w:r>
-        <w:t>fxp.ipynb</w:t>
-      </w:r>
-      <w:proofErr w:type="spellEnd"/>
-      <w:proofErr w:type="gramEnd"/>
-    </w:p>
-    <w:p>
-      <w:proofErr w:type="spellStart"/>
+      <w:r>
+        <w:t>Fcr_high_level_fxp.ipynb</w:t>
+      </w:r>
+    </w:p>
+    <w:p>
       <w:r>
         <w:t>Tx</w:t>
       </w:r>
-      <w:proofErr w:type="spellEnd"/>
     </w:p>
     <w:p>
       <w:r>
@@ -752,11 +649,9 @@
       </w:r>
     </w:p>
     <w:p>
-      <w:proofErr w:type="spellStart"/>
       <w:r>
         <w:t>Rx</w:t>
       </w:r>
-      <w:proofErr w:type="spellEnd"/>
     </w:p>
     <w:p>
       <w:r>
@@ -856,19 +751,9 @@
       </w:r>
     </w:p>
     <w:p>
-      <w:proofErr w:type="spellStart"/>
-      <w:r>
-        <w:t>Half</w:t>
-      </w:r>
-      <w:proofErr w:type="spellEnd"/>
-      <w:r>
-        <w:t xml:space="preserve"> LUT and </w:t>
-      </w:r>
-      <w:proofErr w:type="spellStart"/>
-      <w:r>
-        <w:t>rounding</w:t>
-      </w:r>
-      <w:proofErr w:type="spellEnd"/>
+      <w:r>
+        <w:t>Half LUT and rounding</w:t>
+      </w:r>
     </w:p>
     <w:p>
       <w:r>
@@ -913,13 +798,8 @@
       </w:r>
     </w:p>
     <w:p>
-      <w:proofErr w:type="spellStart"/>
-      <w:r>
-        <w:t>Phase</w:t>
-      </w:r>
-      <w:proofErr w:type="spellEnd"/>
-      <w:r>
-        <w:t xml:space="preserve"> error</w:t>
+      <w:r>
+        <w:t>Phase error</w:t>
       </w:r>
     </w:p>
     <w:p>
@@ -965,11 +845,9 @@
       </w:r>
     </w:p>
     <w:p>
-      <w:proofErr w:type="spellStart"/>
       <w:r>
         <w:t>Integrator</w:t>
       </w:r>
-      <w:proofErr w:type="spellEnd"/>
     </w:p>
     <w:p>
       <w:r>
@@ -1066,20 +944,10 @@
       </w:r>
     </w:p>
     <w:p>
-      <w:proofErr w:type="spellStart"/>
       <w:r>
         <w:lastRenderedPageBreak/>
-        <w:t>Half</w:t>
-      </w:r>
-      <w:proofErr w:type="spellEnd"/>
-      <w:r>
-        <w:t xml:space="preserve"> LUT </w:t>
-      </w:r>
-      <w:proofErr w:type="spellStart"/>
-      <w:r>
-        <w:t>truncating</w:t>
-      </w:r>
-      <w:proofErr w:type="spellEnd"/>
+        <w:t>Half LUT truncating</w:t>
+      </w:r>
     </w:p>
     <w:p>
       <w:r>
@@ -1250,7 +1118,251 @@
         </w:drawing>
       </w:r>
     </w:p>
-    <w:p/>
+    <w:p>
+      <w:r>
+        <w:br w:type="page"/>
+      </w:r>
+    </w:p>
+    <w:p>
+      <w:r>
+        <w:lastRenderedPageBreak/>
+        <w:t>Synthesis</w:t>
+      </w:r>
+    </w:p>
+    <w:p>
+      <w:r>
+        <w:drawing>
+          <wp:inline distT="0" distB="0" distL="0" distR="0" wp14:anchorId="2270C00A" wp14:editId="4D3F3AC0">
+            <wp:extent cx="5731510" cy="1622425"/>
+            <wp:effectExtent l="0" t="0" r="2540" b="0"/>
+            <wp:docPr id="1178926163" name="Picture 1" descr="A screenshot of a computer&#10;&#10;AI-generated content may be incorrect."/>
+            <wp:cNvGraphicFramePr>
+              <a:graphicFrameLocks xmlns:a="http://schemas.openxmlformats.org/drawingml/2006/main" noChangeAspect="1"/>
+            </wp:cNvGraphicFramePr>
+            <a:graphic xmlns:a="http://schemas.openxmlformats.org/drawingml/2006/main">
+              <a:graphicData uri="http://schemas.openxmlformats.org/drawingml/2006/picture">
+                <pic:pic xmlns:pic="http://schemas.openxmlformats.org/drawingml/2006/picture">
+                  <pic:nvPicPr>
+                    <pic:cNvPr id="1178926163" name="Picture 1" descr="A screenshot of a computer&#10;&#10;AI-generated content may be incorrect."/>
+                    <pic:cNvPicPr/>
+                  </pic:nvPicPr>
+                  <pic:blipFill>
+                    <a:blip r:embed="rId22"/>
+                    <a:stretch>
+                      <a:fillRect/>
+                    </a:stretch>
+                  </pic:blipFill>
+                  <pic:spPr>
+                    <a:xfrm>
+                      <a:off x="0" y="0"/>
+                      <a:ext cx="5731510" cy="1622425"/>
+                    </a:xfrm>
+                    <a:prstGeom prst="rect">
+                      <a:avLst/>
+                    </a:prstGeom>
+                  </pic:spPr>
+                </pic:pic>
+              </a:graphicData>
+            </a:graphic>
+          </wp:inline>
+        </w:drawing>
+      </w:r>
+      <w:r>
+        <w:drawing>
+          <wp:inline distT="0" distB="0" distL="0" distR="0" wp14:anchorId="6813B774" wp14:editId="416EEE80">
+            <wp:extent cx="5731510" cy="3141980"/>
+            <wp:effectExtent l="0" t="0" r="2540" b="1270"/>
+            <wp:docPr id="1527937763" name="Picture 1" descr="A screenshot of a graph&#10;&#10;AI-generated content may be incorrect."/>
+            <wp:cNvGraphicFramePr>
+              <a:graphicFrameLocks xmlns:a="http://schemas.openxmlformats.org/drawingml/2006/main" noChangeAspect="1"/>
+            </wp:cNvGraphicFramePr>
+            <a:graphic xmlns:a="http://schemas.openxmlformats.org/drawingml/2006/main">
+              <a:graphicData uri="http://schemas.openxmlformats.org/drawingml/2006/picture">
+                <pic:pic xmlns:pic="http://schemas.openxmlformats.org/drawingml/2006/picture">
+                  <pic:nvPicPr>
+                    <pic:cNvPr id="1527937763" name="Picture 1" descr="A screenshot of a graph&#10;&#10;AI-generated content may be incorrect."/>
+                    <pic:cNvPicPr/>
+                  </pic:nvPicPr>
+                  <pic:blipFill>
+                    <a:blip r:embed="rId23"/>
+                    <a:stretch>
+                      <a:fillRect/>
+                    </a:stretch>
+                  </pic:blipFill>
+                  <pic:spPr>
+                    <a:xfrm>
+                      <a:off x="0" y="0"/>
+                      <a:ext cx="5731510" cy="3141980"/>
+                    </a:xfrm>
+                    <a:prstGeom prst="rect">
+                      <a:avLst/>
+                    </a:prstGeom>
+                  </pic:spPr>
+                </pic:pic>
+              </a:graphicData>
+            </a:graphic>
+          </wp:inline>
+        </w:drawing>
+      </w:r>
+      <w:r>
+        <w:drawing>
+          <wp:inline distT="0" distB="0" distL="0" distR="0" wp14:anchorId="751B1268" wp14:editId="0DA88A9B">
+            <wp:extent cx="3124636" cy="1609950"/>
+            <wp:effectExtent l="0" t="0" r="0" b="9525"/>
+            <wp:docPr id="1147220791" name="Picture 1" descr="A screenshot of a computer&#10;&#10;AI-generated content may be incorrect."/>
+            <wp:cNvGraphicFramePr>
+              <a:graphicFrameLocks xmlns:a="http://schemas.openxmlformats.org/drawingml/2006/main" noChangeAspect="1"/>
+            </wp:cNvGraphicFramePr>
+            <a:graphic xmlns:a="http://schemas.openxmlformats.org/drawingml/2006/main">
+              <a:graphicData uri="http://schemas.openxmlformats.org/drawingml/2006/picture">
+                <pic:pic xmlns:pic="http://schemas.openxmlformats.org/drawingml/2006/picture">
+                  <pic:nvPicPr>
+                    <pic:cNvPr id="1147220791" name="Picture 1" descr="A screenshot of a computer&#10;&#10;AI-generated content may be incorrect."/>
+                    <pic:cNvPicPr/>
+                  </pic:nvPicPr>
+                  <pic:blipFill>
+                    <a:blip r:embed="rId24"/>
+                    <a:stretch>
+                      <a:fillRect/>
+                    </a:stretch>
+                  </pic:blipFill>
+                  <pic:spPr>
+                    <a:xfrm>
+                      <a:off x="0" y="0"/>
+                      <a:ext cx="3124636" cy="1609950"/>
+                    </a:xfrm>
+                    <a:prstGeom prst="rect">
+                      <a:avLst/>
+                    </a:prstGeom>
+                  </pic:spPr>
+                </pic:pic>
+              </a:graphicData>
+            </a:graphic>
+          </wp:inline>
+        </w:drawing>
+      </w:r>
+    </w:p>
+    <w:p>
+      <w:r>
+        <w:t>Implementation</w:t>
+      </w:r>
+    </w:p>
+    <w:p>
+      <w:r>
+        <w:lastRenderedPageBreak/>
+        <w:drawing>
+          <wp:inline distT="0" distB="0" distL="0" distR="0" wp14:anchorId="4EB858E2" wp14:editId="705F69EB">
+            <wp:extent cx="5731510" cy="2900680"/>
+            <wp:effectExtent l="0" t="0" r="2540" b="0"/>
+            <wp:docPr id="1805065289" name="Picture 1" descr="A screenshot of a computer&#10;&#10;AI-generated content may be incorrect."/>
+            <wp:cNvGraphicFramePr>
+              <a:graphicFrameLocks xmlns:a="http://schemas.openxmlformats.org/drawingml/2006/main" noChangeAspect="1"/>
+            </wp:cNvGraphicFramePr>
+            <a:graphic xmlns:a="http://schemas.openxmlformats.org/drawingml/2006/main">
+              <a:graphicData uri="http://schemas.openxmlformats.org/drawingml/2006/picture">
+                <pic:pic xmlns:pic="http://schemas.openxmlformats.org/drawingml/2006/picture">
+                  <pic:nvPicPr>
+                    <pic:cNvPr id="1805065289" name="Picture 1" descr="A screenshot of a computer&#10;&#10;AI-generated content may be incorrect."/>
+                    <pic:cNvPicPr/>
+                  </pic:nvPicPr>
+                  <pic:blipFill>
+                    <a:blip r:embed="rId25"/>
+                    <a:stretch>
+                      <a:fillRect/>
+                    </a:stretch>
+                  </pic:blipFill>
+                  <pic:spPr>
+                    <a:xfrm>
+                      <a:off x="0" y="0"/>
+                      <a:ext cx="5731510" cy="2900680"/>
+                    </a:xfrm>
+                    <a:prstGeom prst="rect">
+                      <a:avLst/>
+                    </a:prstGeom>
+                  </pic:spPr>
+                </pic:pic>
+              </a:graphicData>
+            </a:graphic>
+          </wp:inline>
+        </w:drawing>
+      </w:r>
+      <w:r>
+        <w:drawing>
+          <wp:inline distT="0" distB="0" distL="0" distR="0" wp14:anchorId="4E8825A7" wp14:editId="35EDAD07">
+            <wp:extent cx="5731510" cy="1222375"/>
+            <wp:effectExtent l="0" t="0" r="2540" b="0"/>
+            <wp:docPr id="1151738024" name="Picture 1" descr="A screenshot of a computer&#10;&#10;AI-generated content may be incorrect."/>
+            <wp:cNvGraphicFramePr>
+              <a:graphicFrameLocks xmlns:a="http://schemas.openxmlformats.org/drawingml/2006/main" noChangeAspect="1"/>
+            </wp:cNvGraphicFramePr>
+            <a:graphic xmlns:a="http://schemas.openxmlformats.org/drawingml/2006/main">
+              <a:graphicData uri="http://schemas.openxmlformats.org/drawingml/2006/picture">
+                <pic:pic xmlns:pic="http://schemas.openxmlformats.org/drawingml/2006/picture">
+                  <pic:nvPicPr>
+                    <pic:cNvPr id="1151738024" name="Picture 1" descr="A screenshot of a computer&#10;&#10;AI-generated content may be incorrect."/>
+                    <pic:cNvPicPr/>
+                  </pic:nvPicPr>
+                  <pic:blipFill>
+                    <a:blip r:embed="rId26"/>
+                    <a:stretch>
+                      <a:fillRect/>
+                    </a:stretch>
+                  </pic:blipFill>
+                  <pic:spPr>
+                    <a:xfrm>
+                      <a:off x="0" y="0"/>
+                      <a:ext cx="5731510" cy="1222375"/>
+                    </a:xfrm>
+                    <a:prstGeom prst="rect">
+                      <a:avLst/>
+                    </a:prstGeom>
+                  </pic:spPr>
+                </pic:pic>
+              </a:graphicData>
+            </a:graphic>
+          </wp:inline>
+        </w:drawing>
+      </w:r>
+    </w:p>
+    <w:p>
+      <w:r>
+        <w:drawing>
+          <wp:inline distT="0" distB="0" distL="0" distR="0" wp14:anchorId="5B46A4AF" wp14:editId="10FC6ABF">
+            <wp:extent cx="5731510" cy="2640330"/>
+            <wp:effectExtent l="0" t="0" r="2540" b="7620"/>
+            <wp:docPr id="830058274" name="Picture 1" descr="A screenshot of a graph&#10;&#10;AI-generated content may be incorrect."/>
+            <wp:cNvGraphicFramePr>
+              <a:graphicFrameLocks xmlns:a="http://schemas.openxmlformats.org/drawingml/2006/main" noChangeAspect="1"/>
+            </wp:cNvGraphicFramePr>
+            <a:graphic xmlns:a="http://schemas.openxmlformats.org/drawingml/2006/main">
+              <a:graphicData uri="http://schemas.openxmlformats.org/drawingml/2006/picture">
+                <pic:pic xmlns:pic="http://schemas.openxmlformats.org/drawingml/2006/picture">
+                  <pic:nvPicPr>
+                    <pic:cNvPr id="830058274" name="Picture 1" descr="A screenshot of a graph&#10;&#10;AI-generated content may be incorrect."/>
+                    <pic:cNvPicPr/>
+                  </pic:nvPicPr>
+                  <pic:blipFill>
+                    <a:blip r:embed="rId27"/>
+                    <a:stretch>
+                      <a:fillRect/>
+                    </a:stretch>
+                  </pic:blipFill>
+                  <pic:spPr>
+                    <a:xfrm>
+                      <a:off x="0" y="0"/>
+                      <a:ext cx="5731510" cy="2640330"/>
+                    </a:xfrm>
+                    <a:prstGeom prst="rect">
+                      <a:avLst/>
+                    </a:prstGeom>
+                  </pic:spPr>
+                </pic:pic>
+              </a:graphicData>
+            </a:graphic>
+          </wp:inline>
+        </w:drawing>
+      </w:r>
+    </w:p>
     <w:sectPr>
       <w:pgSz w:w="11906" w:h="16838"/>
       <w:pgMar w:top="1440" w:right="1440" w:bottom="1440" w:left="1440" w:header="708" w:footer="708" w:gutter="0"/>

</xml_diff>